<commit_message>
Update CV: dates, certificates, language detection, and sorting
</commit_message>
<xml_diff>
--- a/Alesia_Zayats_CV.docx
+++ b/Alesia_Zayats_CV.docx
@@ -43,101 +43,26 @@
         <w:ind w:left="0" w:right="0" w:firstLine="0"/>
         <w:jc w:val="center"/>
       </w:pPr>
-      <w:r>
-        <w:fldChar w:fldCharType="begin"/>
-      </w:r>
-      <w:r>
-        <w:instrText>HYPERLINK "mailto:alesiaromasko19@gmail.com"</w:instrText>
-      </w:r>
-      <w:r>
-        <w:fldChar w:fldCharType="separate"/>
-      </w:r>
-      <w:r>
-        <w:rPr>
-          <w:rStyle w:val="a3"/>
-        </w:rPr>
-        <w:t>alesiaromasko19@g</w:t>
-      </w:r>
-      <w:r>
-        <w:rPr>
-          <w:rStyle w:val="a3"/>
-        </w:rPr>
-        <w:t>m</w:t>
-      </w:r>
-      <w:r>
-        <w:rPr>
-          <w:rStyle w:val="a3"/>
-        </w:rPr>
-        <w:t>ail.com</w:t>
-      </w:r>
-      <w:r>
-        <w:fldChar w:fldCharType="end"/>
-      </w:r>
-      <w:r>
-        <w:t xml:space="preserve"> </w:t>
-      </w:r>
-      <w:r>
-        <w:t>|</w:t>
-      </w:r>
-      <w:r>
-        <w:t xml:space="preserve"> </w:t>
-      </w:r>
-      <w:r>
-        <w:t>+375298508516</w:t>
-      </w:r>
-      <w:r>
-        <w:t xml:space="preserve"> </w:t>
-      </w:r>
-      <w:r>
-        <w:t>|</w:t>
-      </w:r>
-      <w:r>
-        <w:t xml:space="preserve"> </w:t>
-      </w:r>
-      <w:r>
-        <w:t>Belarus, Minsk</w:t>
-      </w:r>
-      <w:r>
-        <w:t xml:space="preserve"> </w:t>
-      </w:r>
-      <w:r>
-        <w:t xml:space="preserve">| </w:t>
-      </w:r>
-      <w:proofErr w:type="spellStart"/>
-      <w:r>
-        <w:t>linkedin</w:t>
-      </w:r>
-      <w:proofErr w:type="spellEnd"/>
-      <w:r>
-        <w:t xml:space="preserve">: </w:t>
-      </w:r>
       <w:hyperlink r:id="rId5" w:history="1">
-        <w:proofErr w:type="spellStart"/>
+        <w:r>
+          <w:rPr>
+            <w:rStyle w:val="a3"/>
+          </w:rPr>
+          <w:t>alesiaromasko19@gmail.com</w:t>
+        </w:r>
+      </w:hyperlink>
+      <w:r>
+        <w:t xml:space="preserve"> | +375298508516 | Belarus, Minsk | linkedin: </w:t>
+      </w:r>
+      <w:hyperlink r:id="rId6" w:history="1">
         <w:r>
           <w:rPr>
             <w:rStyle w:val="a3"/>
             <w:color w:val="000000" w:themeColor="text1"/>
             <w:u w:val="none"/>
           </w:rPr>
-          <w:t>alesiaroma</w:t>
+          <w:t>alesiaromasko</w:t>
         </w:r>
-        <w:r>
-          <w:rPr>
-            <w:rStyle w:val="a3"/>
-            <w:color w:val="000000" w:themeColor="text1"/>
-            <w:u w:val="none"/>
-          </w:rPr>
-          <w:t>s</w:t>
-        </w:r>
-        <w:r>
-          <w:rPr>
-            <w:rStyle w:val="a3"/>
-            <w:color w:val="000000" w:themeColor="text1"/>
-            <w:u w:val="none"/>
-          </w:rPr>
-          <w:t>ko</w:t>
-        </w:r>
-        <w:proofErr w:type="spellEnd"/>
       </w:hyperlink>
     </w:p>
     <w:p>
@@ -250,8 +175,8 @@
           </mc:Choice>
           <mc:Fallback>
             <w:pict>
-              <v:group w14:anchorId="5DDA6195" id="Group 3587" o:spid="_x0000_s1026" style="position:absolute;margin-left:-.35pt;margin-top:16.1pt;width:470.95pt;height:.75pt;z-index:-251648000" coordsize="59816,95" o:gfxdata="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">
-                <v:shape id="Shape 4128" o:spid="_x0000_s1027" style="position:absolute;width:59816;height:95;visibility:visible;mso-wrap-style:square;v-text-anchor:top" coordsize="5981699,9525" o:gfxdata="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" path="m,l5981699,r,9525l,9525,,e" fillcolor="black" stroked="f" strokeweight="0">
+              <v:group w14:anchorId="5DDA6195" id="Group 3587" o:spid="_x0000_s1026" style="position:absolute;margin-left:-.35pt;margin-top:16.1pt;width:470.95pt;height:.75pt;z-index:-251648000" coordsize="59816,95" o:gfxdata="UEsDBBQABgAIAAAAIQC2gziS/gAAAOEBAAATAAAAW0NvbnRlbnRfVHlwZXNdLnhtbJSRQU7DMBBF 90jcwfIWJU67QAgl6YK0S0CoHGBkTxKLZGx5TGhvj5O2G0SRWNoz/78nu9wcxkFMGNg6quQqL6RA 0s5Y6ir5vt9lD1JwBDIwOMJKHpHlpr69KfdHjyxSmriSfYz+USnWPY7AufNIadK6MEJMx9ApD/oD OlTrorhX2lFEilmcO2RdNtjC5xDF9pCuTyYBB5bi6bQ4syoJ3g9WQ0ymaiLzg5KdCXlKLjvcW893 SUOqXwnz5DrgnHtJTxOsQfEKIT7DmDSUCaxw7Rqn8787ZsmRM9e2VmPeBN4uqYvTtW7jvijg9N/y JsXecLq0q+WD6m8AAAD//wMAUEsDBBQABgAIAAAAIQA4/SH/1gAAAJQBAAALAAAAX3JlbHMvLnJl bHOkkMFqwzAMhu+DvYPRfXGawxijTi+j0GvpHsDYimMaW0Yy2fr2M4PBMnrbUb/Q94l/f/hMi1qR JVI2sOt6UJgd+ZiDgffL8ekFlFSbvV0oo4EbChzGx4f9GRdb25HMsYhqlCwG5lrLq9biZkxWOiqY 22YiTra2kYMu1l1tQD30/bPm3wwYN0x18gb45AdQl1tp5j/sFB2T0FQ7R0nTNEV3j6o9feQzro1i OWA14Fm+Q8a1a8+Bvu/d/dMb2JY5uiPbhG/ktn4cqGU/er3pcvwCAAD//wMAUEsDBBQABgAIAAAA IQDfVMttcAIAAC0GAAAOAAAAZHJzL2Uyb0RvYy54bWykVMtu2zAQvBfoPxC615KN2o0Fyzk0rS9F GzTJB9AUKQngCyRt2X/f5ephxWlaNPVBXpG7o53hcja3JyXJkTvfGF0k81mWEK6ZKRtdFcnT49cP NwnxgeqSSqN5kZy5T263799tWpvzhamNLLkjAKJ93toiqUOweZp6VnNF/cxYrmFTGKdogFdXpaWj LaArmS6ybJW2xpXWGca9h9W7bjPZIr4QnIUfQngeiCwS6C3g0+FzH5/pdkPzylFbN6xvg76hC0Ub DR8doe5ooOTgmhdQqmHOeCPCjBmVGiEaxpEDsJlnV2x2zhwscqnytrKjTCDtlU5vhmXfjztnH+y9 AyVaW4EW+Ba5nIRT8R+6JCeU7DxKxk+BMFhcrm/m2WqZEAZ76+Vi2SnKapD9RRGrv0zKVuv187J0 +GT6rJHWwmj4C3v/f+wfamo5iupzYH/vSFMWycf5AiZVUwUzihkEV1AUzBsl8rkHtf5Fn9eJ0pwd fNhxgzrT4zcfuoEsh4jWQ8ROeggdjPUfB9rSEOtikzEkbXdQ2Ejdn1PcVObIHw2mhavTgsO47Eo9 zYpnjlDDOEDukDH8W8SbZg7D8WoyXM/JDP0lDW/umANB5Lnd9AFyh3iqrtRRBvgIo+AzQtKAF1Y1 AQxINgrca/Epyy7AgBZHrzttjMJZ8iiW1D+5gLHBSxEXvKv2n6UjRxptBn8ITqWtab8aLwa01Kdi jDixXjRSjpBzLP0dZIfQJ8c6jg43VmZdJeu76WwOzAJID2YHHYxF+GWjw1ivwaKxzQnbGO5NeUaD QEHgLqI06EnIo/fPaHrTd8y6uPz2FwAAAP//AwBQSwMEFAAGAAgAAAAhABlT/IjhAAAADAEAAA8A AABkcnMvZG93bnJldi54bWxMT0tPwzAMviPxHyIjcdvSBzDomk7TeJwmJDYkxM1rvLZak1RN1nb/ HnOCi2X7s79HvppMKwbqfeOsgngegSBbOt3YSsHn/nX2CMIHtBpbZ0nBhTysiuurHDPtRvtBwy5U gkmsz1BBHUKXSenLmgz6uevIMnZ0vcHAY19J3ePI5KaVSRQ9SIONZYUaO9rUVJ52Z6PgbcRxncYv w/Z03Fy+9/fvX9uYlLq9mZ6XXNZLEIGm8PcBvxnYPxRs7ODOVnvRKpgt+FBBmiQgGH66i7k58CJd gCxy+T9E8QMAAP//AwBQSwECLQAUAAYACAAAACEAtoM4kv4AAADhAQAAEwAAAAAAAAAAAAAAAAAA AAAAW0NvbnRlbnRfVHlwZXNdLnhtbFBLAQItABQABgAIAAAAIQA4/SH/1gAAAJQBAAALAAAAAAAA AAAAAAAAAC8BAABfcmVscy8ucmVsc1BLAQItABQABgAIAAAAIQDfVMttcAIAAC0GAAAOAAAAAAAA AAAAAAAAAC4CAABkcnMvZTJvRG9jLnhtbFBLAQItABQABgAIAAAAIQAZU/yI4QAAAAwBAAAPAAAA AAAAAAAAAAAAAMoEAABkcnMvZG93bnJldi54bWxQSwUGAAAAAAQABADzAAAA2AUAAAAA ">
+                <v:shape id="Shape 4128" o:spid="_x0000_s1027" style="position:absolute;width:59816;height:95;visibility:visible;mso-wrap-style:square;v-text-anchor:top" coordsize="5981699,9525" o:gfxdata="UEsDBBQABgAIAAAAIQDb4fbL7gAAAIUBAAATAAAAW0NvbnRlbnRfVHlwZXNdLnhtbHyQz07DMAyH 70i8Q+QralM4IITa7kDhCAiNB7ASt43WOlEcyvb2pNu4IODoPz9/n1xv9vOkForiPDdwXVagiI23 jocG3rdPxR0oScgWJ8/UwIEENu3lRb09BBKV0ywNjCmFe63FjDSjlD4Q50nv44wpl3HQAc0OB9I3 VXWrjedEnIq03oC27qjHjympx31un0wiTQLq4bS4shrAECZnMGVTvbD9QSnOhDInjzsyuiBXWQP0 r4R18jfgnHvJr4nOknrFmJ5xzhraRtHWf3Kkpfz/yGo5S+H73hkquyhdjr3R8m2lj09svwAAAP// AwBQSwMEFAAGAAgAAAAhAFr0LFu/AAAAFQEAAAsAAABfcmVscy8ucmVsc2zPwWrDMAwG4Ptg72B0 X5TuUMaI01uh19I+gLGVxCy2jGSy9e1nemrHjpL4P0nD4SetZiPRyNnCruvBUPYcYp4tXC/Htw8w Wl0ObuVMFm6kcBhfX4Yzra62kC6xqGlKVgtLreUTUf1CyWnHhXKbTCzJ1VbKjMX5LzcTvvf9HuXR gPHJNKdgQU5hB+ZyK23zHztFL6w81c5zQp6m6P9TMfB3PtPWFCczVQtB9N4U2rp2HOA44NMz4y8A AAD//wMAUEsDBBQABgAIAAAAIQCTcdyjygAAAOIAAAAPAAAAZHJzL2Rvd25yZXYueG1sRI/RSsNA EEXfhf7DMgXf7CZBbEm7LaFaCYjQVj9gyE6T0OxsyK5N9OudB8GXgctwz8zZ7CbXqRsNofVsIF0k oIgrb1uuDXx+HB5WoEJEtth5JgPfFGC3nd1tMLd+5BPdzrFWAuGQo4Emxj7XOlQNOQwL3xPL7uIH h1HiUGs74Chw1+ksSZ60w5blQoM97RuqrucvZ+C1fAnv9dJ2WVEe3PiWFsvrz9GY+/n0vJZRrEFF muJ/4w9RWgOPaSY/i5LogN7+AgAA//8DAFBLAQItABQABgAIAAAAIQDb4fbL7gAAAIUBAAATAAAA AAAAAAAAAAAAAAAAAABbQ29udGVudF9UeXBlc10ueG1sUEsBAi0AFAAGAAgAAAAhAFr0LFu/AAAA FQEAAAsAAAAAAAAAAAAAAAAAHwEAAF9yZWxzLy5yZWxzUEsBAi0AFAAGAAgAAAAhAJNx3KPKAAAA 4gAAAA8AAAAAAAAAAAAAAAAABwIAAGRycy9kb3ducmV2LnhtbFBLBQYAAAAAAwADALcAAAD+AgAA AAA= " path="m,l5981699,r,9525l,9525,,e" fillcolor="black" stroked="f" strokeweight="0">
                   <v:stroke miterlimit="83231f" joinstyle="miter"/>
                   <v:path arrowok="t" textboxrect="0,0,5981699,9525"/>
                 </v:shape>
@@ -491,7 +416,7 @@
           </mc:Choice>
           <mc:Fallback>
             <w:pict>
-              <v:shape w14:anchorId="27674B8C" id="Shape 4132" o:spid="_x0000_s1026" style="position:absolute;margin-left:.2pt;margin-top:15.4pt;width:470.95pt;height:.75pt;z-index:-251645952;visibility:visible;mso-wrap-style:square;mso-wrap-distance-left:9pt;mso-wrap-distance-top:0;mso-wrap-distance-right:9pt;mso-wrap-distance-bottom:0;mso-position-horizontal:absolute;mso-position-horizontal-relative:text;mso-position-vertical:absolute;mso-position-vertical-relative:text;v-text-anchor:top" coordsize="5981699,9525" o:gfxdata="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" path="m,l5981699,r,9525l,9525,,e" fillcolor="black" stroked="f" strokeweight="0">
+              <v:shape w14:anchorId="27674B8C" id="Shape 4132" o:spid="_x0000_s1026" style="position:absolute;margin-left:.2pt;margin-top:15.4pt;width:470.95pt;height:.75pt;z-index:-251645952;visibility:visible;mso-wrap-style:square;mso-wrap-distance-left:9pt;mso-wrap-distance-top:0;mso-wrap-distance-right:9pt;mso-wrap-distance-bottom:0;mso-position-horizontal:absolute;mso-position-horizontal-relative:text;mso-position-vertical:absolute;mso-position-vertical-relative:text;v-text-anchor:top" coordsize="5981699,9525" o:gfxdata="UEsDBBQABgAIAAAAIQC2gziS/gAAAOEBAAATAAAAW0NvbnRlbnRfVHlwZXNdLnhtbJSRQU7DMBBF 90jcwfIWJU67QAgl6YK0S0CoHGBkTxKLZGx5TGhvj5O2G0SRWNoz/78nu9wcxkFMGNg6quQqL6RA 0s5Y6ir5vt9lD1JwBDIwOMJKHpHlpr69KfdHjyxSmriSfYz+USnWPY7AufNIadK6MEJMx9ApD/oD OlTrorhX2lFEilmcO2RdNtjC5xDF9pCuTyYBB5bi6bQ4syoJ3g9WQ0ymaiLzg5KdCXlKLjvcW893 SUOqXwnz5DrgnHtJTxOsQfEKIT7DmDSUCaxw7Rqn8787ZsmRM9e2VmPeBN4uqYvTtW7jvijg9N/y JsXecLq0q+WD6m8AAAD//wMAUEsDBBQABgAIAAAAIQA4/SH/1gAAAJQBAAALAAAAX3JlbHMvLnJl bHOkkMFqwzAMhu+DvYPRfXGawxijTi+j0GvpHsDYimMaW0Yy2fr2M4PBMnrbUb/Q94l/f/hMi1qR JVI2sOt6UJgd+ZiDgffL8ekFlFSbvV0oo4EbChzGx4f9GRdb25HMsYhqlCwG5lrLq9biZkxWOiqY 22YiTra2kYMu1l1tQD30/bPm3wwYN0x18gb45AdQl1tp5j/sFB2T0FQ7R0nTNEV3j6o9feQzro1i OWA14Fm+Q8a1a8+Bvu/d/dMb2JY5uiPbhG/ktn4cqGU/er3pcvwCAAD//wMAUEsDBBQABgAIAAAA IQCIXpPsIAIAAP0EAAAOAAAAZHJzL2Uyb0RvYy54bWysVE2P2yAQvVfqf0DcG9upkm6sOHvoqr1U bdXd/gCCIUbCgICNnX/fYfyp3aqVqvpgj2Hm8d6D4Xjft5pchQ/KmooWm5wSYbitlblU9OfTp3d3 lITITM20NaKiNxHo/entm2PnSrG1jdW18ARATCg7V9EmRldmWeCNaFnYWCcMTErrWxbh11+y2rMO 0FudbfN8n3XW185bLkKA0Ydhkp4QX0rB4zcpg4hEVxS4RXx7fJ/TOzsdWXnxzDWKjzTYP7BomTKw 6Az1wCIjz169gmoV9zZYGTfctpmVUnGBGkBNkb9Q89gwJ1ALmBPcbFP4f7D86/XRffdgQ+dCGSBM Knrp2/QFfqRHs26zWaKPhMPg7nBX5PsdJRzmDrviffIyW2r5c4ifhUUcdv0S4mB1PUWsmSLemyn0 sGF/3CrHYqpL5FJIuoHI/nCgpEk8tjvch9ZexZPFtPhCAnBcZrVZZyVNCDXJhdwpY/o6xFtn4qKD +Clp+g7JcPDQI+D29zQ8k/O6ECSd6OysHQbX7mqTbIBFOIMOkprFwQIVobW0aqEvtx/yfAEGtGW3 MYo3LZJZ2vwQkqgaNz0NBH85f9SeXFlqIHwQnGnXsHF0FDWmIlXESfVSaT1DFlj6O8jBljE51Qns 3bkyHyr5yGZoYLhhQPTUxmDKXIQrWxPnegOXD9JcqU3h2dY3PP1oCPQYsh/vg9TE63+0bbm1Tr8A AAD//wMAUEsDBBQABgAIAAAAIQBd0z7P4AAAAAsBAAAPAAAAZHJzL2Rvd25yZXYueG1sTE/NTsMw DL4j8Q6RkbixdN3ERtd0qoChSRMSbDxA1pi2WuJUTbYWnh5zgost+7O/n3w9Oisu2IfWk4LpJAGB VHnTUq3g47C5W4IIUZPR1hMq+MIA6+L6KteZ8QO942Ufa8EkFDKtoImxy6QMVYNOh4nvkBj79L3T kce+lqbXA5M7K9MkuZdOt8QKje7wscHqtD87BS/b5/BaL4xNy+3GDbtpuTh9vyl1ezM+rbiUKxAR x/j3Ab8Z2D8UbOzoz2SCsArmfKdglnAIRh/m6QzEkRfcZZHL/xmKHwAAAP//AwBQSwECLQAUAAYA CAAAACEAtoM4kv4AAADhAQAAEwAAAAAAAAAAAAAAAAAAAAAAW0NvbnRlbnRfVHlwZXNdLnhtbFBL AQItABQABgAIAAAAIQA4/SH/1gAAAJQBAAALAAAAAAAAAAAAAAAAAC8BAABfcmVscy8ucmVsc1BL AQItABQABgAIAAAAIQCIXpPsIAIAAP0EAAAOAAAAAAAAAAAAAAAAAC4CAABkcnMvZTJvRG9jLnht bFBLAQItABQABgAIAAAAIQBd0z7P4AAAAAsBAAAPAAAAAAAAAAAAAAAAAHoEAABkcnMvZG93bnJl di54bWxQSwUGAAAAAAQABADzAAAAhwUAAAAA " path="m,l5981699,r,9525l,9525,,e" fillcolor="black" stroked="f" strokeweight="0">
                 <v:stroke miterlimit="83231f" joinstyle="miter"/>
                 <v:path arrowok="t" textboxrect="0,0,5981699,9525"/>
               </v:shape>
@@ -503,13 +428,7 @@
         <w:rPr>
           <w:lang w:val="en-US"/>
         </w:rPr>
-        <w:t>Core</w:t>
-      </w:r>
-      <w:r>
-        <w:rPr>
-          <w:lang w:val="en-US"/>
-        </w:rPr>
-        <w:t xml:space="preserve"> </w:t>
+        <w:t xml:space="preserve">Core </w:t>
       </w:r>
       <w:r>
         <w:t>Skills</w:t>
@@ -522,91 +441,7 @@
         <w:jc w:val="both"/>
       </w:pPr>
       <w:r>
-        <w:t>Full-cycle Recruitment</w:t>
-      </w:r>
-      <w:r>
-        <w:t>,</w:t>
-      </w:r>
-      <w:r>
-        <w:t xml:space="preserve"> Stakeholder Management</w:t>
-      </w:r>
-      <w:r>
-        <w:t xml:space="preserve">, </w:t>
-      </w:r>
-      <w:r>
-        <w:t>Hiring Manager Consulting</w:t>
-      </w:r>
-      <w:r>
-        <w:t>,</w:t>
-      </w:r>
-      <w:r>
-        <w:t xml:space="preserve"> Talent Acquisition Strategy</w:t>
-      </w:r>
-      <w:r>
-        <w:t xml:space="preserve">, </w:t>
-      </w:r>
-      <w:r>
-        <w:t>Market Intelligence</w:t>
-      </w:r>
-      <w:r>
-        <w:t>,</w:t>
-      </w:r>
-      <w:r>
-        <w:t xml:space="preserve"> Salary Benchmarking</w:t>
-      </w:r>
-      <w:r>
-        <w:t>,</w:t>
-      </w:r>
-      <w:r>
-        <w:t xml:space="preserve"> Recruitment Analytics</w:t>
-      </w:r>
-      <w:r>
-        <w:t>,</w:t>
-      </w:r>
-      <w:r>
-        <w:t xml:space="preserve"> Funnel Optimization</w:t>
-      </w:r>
-      <w:r>
-        <w:t>,</w:t>
-      </w:r>
-      <w:r>
-        <w:t xml:space="preserve"> Boolean Search</w:t>
-      </w:r>
-      <w:r>
-        <w:t>,</w:t>
-      </w:r>
-      <w:r>
-        <w:t xml:space="preserve"> X-Ray Search</w:t>
-      </w:r>
-      <w:r>
-        <w:t>,</w:t>
-      </w:r>
-      <w:r>
-        <w:t xml:space="preserve"> LinkedIn Recruiter</w:t>
-      </w:r>
-      <w:r>
-        <w:t>,</w:t>
-      </w:r>
-      <w:r>
-        <w:t xml:space="preserve"> GitHub Sourcing</w:t>
-      </w:r>
-      <w:r>
-        <w:t>,</w:t>
-      </w:r>
-      <w:r>
-        <w:t xml:space="preserve"> Data-driven Recruitment</w:t>
-      </w:r>
-      <w:r>
-        <w:t xml:space="preserve">, </w:t>
-      </w:r>
-      <w:r>
-        <w:t>Offer Negotiation</w:t>
-      </w:r>
-      <w:r>
-        <w:t>,</w:t>
-      </w:r>
-      <w:r>
-        <w:t xml:space="preserve"> ATS Optimization</w:t>
+        <w:t>Full-cycle Recruitment, Stakeholder Management, Hiring Manager Consulting, Talent Acquisition Strategy, Market Intelligence, Salary Benchmarking, Recruitment Analytics, Funnel Optimization, Boolean Search, X-Ray Search, LinkedIn Recruiter, GitHub Sourcing, Data-driven Recruitment, Offer Negotiation, ATS Optimization</w:t>
       </w:r>
     </w:p>
     <w:p>
@@ -716,8 +551,8 @@
           </mc:Choice>
           <mc:Fallback>
             <w:pict>
-              <v:group w14:anchorId="60A8F73E" id="Group 3588" o:spid="_x0000_s1026" style="position:absolute;margin-left:-.35pt;margin-top:16.6pt;width:470.95pt;height:.75pt;z-index:-251649024" coordsize="59816,95" o:gfxdata="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">
-                <v:shape id="Shape 4130" o:spid="_x0000_s1027" style="position:absolute;width:59816;height:95;visibility:visible;mso-wrap-style:square;v-text-anchor:top" coordsize="5981699,9525" o:gfxdata="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" path="m,l5981699,r,9525l,9525,,e" fillcolor="black" stroked="f" strokeweight="0">
+              <v:group w14:anchorId="60A8F73E" id="Group 3588" o:spid="_x0000_s1026" style="position:absolute;margin-left:-.35pt;margin-top:16.6pt;width:470.95pt;height:.75pt;z-index:-251649024" coordsize="59816,95" o:gfxdata="UEsDBBQABgAIAAAAIQC2gziS/gAAAOEBAAATAAAAW0NvbnRlbnRfVHlwZXNdLnhtbJSRQU7DMBBF 90jcwfIWJU67QAgl6YK0S0CoHGBkTxKLZGx5TGhvj5O2G0SRWNoz/78nu9wcxkFMGNg6quQqL6RA 0s5Y6ir5vt9lD1JwBDIwOMJKHpHlpr69KfdHjyxSmriSfYz+USnWPY7AufNIadK6MEJMx9ApD/oD OlTrorhX2lFEilmcO2RdNtjC5xDF9pCuTyYBB5bi6bQ4syoJ3g9WQ0ymaiLzg5KdCXlKLjvcW893 SUOqXwnz5DrgnHtJTxOsQfEKIT7DmDSUCaxw7Rqn8787ZsmRM9e2VmPeBN4uqYvTtW7jvijg9N/y JsXecLq0q+WD6m8AAAD//wMAUEsDBBQABgAIAAAAIQA4/SH/1gAAAJQBAAALAAAAX3JlbHMvLnJl bHOkkMFqwzAMhu+DvYPRfXGawxijTi+j0GvpHsDYimMaW0Yy2fr2M4PBMnrbUb/Q94l/f/hMi1qR JVI2sOt6UJgd+ZiDgffL8ekFlFSbvV0oo4EbChzGx4f9GRdb25HMsYhqlCwG5lrLq9biZkxWOiqY 22YiTra2kYMu1l1tQD30/bPm3wwYN0x18gb45AdQl1tp5j/sFB2T0FQ7R0nTNEV3j6o9feQzro1i OWA14Fm+Q8a1a8+Bvu/d/dMb2JY5uiPbhG/ktn4cqGU/er3pcvwCAAD//wMAUEsDBBQABgAIAAAA IQA8Xnp3bwIAAC0GAAAOAAAAZHJzL2Uyb0RvYy54bWykVNuO0zAQfUfiH6y806SFlm3UdB9Y6AuC Fbt8gOvYSSTfZLtN+/eMJ5dmuyyIpQ/pxJ45mXM8Ppvbk5LkyJ1vjC6S+SxLCNfMlI2uiuTn45d3 NwnxgeqSSqN5kZy5T263b99sWpvzhamNLLkjAKJ93toiqUOweZp6VnNF/cxYrmFTGKdogFdXpaWj LaArmS6ybJW2xpXWGca9h9W7bjPZIr4QnIXvQngeiCwS6C3g0+FzH5/pdkPzylFbN6xvg76iC0Ub DR8doe5ooOTgmmdQqmHOeCPCjBmVGiEaxpEDsJlnV2x2zhwscqnytrKjTCDtlU6vhmXfjjtnH+y9 AyVaW4EW+Ba5nIRT8R+6JCeU7DxKxk+BMFhcrm/m2WqZEAZ76+Vi2SnKapD9WRGrP0/KVuv107J0 +GT6pJHWwmj4C3v/f+wfamo5iupzYH/vSFMWyYf5exgPTRXMKGYQXEFRMG+UyOce1PoXfV4mSnN2 8GHHDepMj1996AayHCJaDxE76SF0MNZ/HGhLQ6yLTcaQtN1BYSN1f05xU5kjfzSYFq5OCw7jsiv1 NCueOUIN4wC5Q8bwbxFvmjkMx4vJoP9khv6Shjd3zIEg8txu+gC5QzxVV+ooA3yEUfAZIWnAC6ua AAYkGwXutfiYZRdgQIuj1502RuEseRRL6h9cwNjgpYgL3lX7T9KRI402gz8Ep9LWtF+NFwNa6lMx RpxYLxopR8g5lv4OskPok2MdR4cbK7OukvXddDYHZgGkB7ODDsYi/LLRYazXYNHY5oRtDPemPKNB oCBwF1Ea9CTk0ftnNL3pO2ZdXH77CwAA//8DAFBLAwQUAAYACAAAACEAleJI6eIAAAAMAQAADwAA AGRycy9kb3ducmV2LnhtbExPS2/CMAy+T9p/iDxpN0hL2dhKU4TY44QmDSZNu5nGtBVNUjWhLf9+ 5rRdLNuf/T2y1Wga0VPna2cVxNMIBNnC6dqWCr72b5MnED6g1dg4Swou5GGV395kmGo32E/qd6EU TGJ9igqqENpUSl9UZNBPXUuWsaPrDAYeu1LqDgcmN42cRdGjNFhbVqiwpU1FxWl3NgreBxzWSfza b0/HzeVn//DxvY1Jqfu78WXJZb0EEWgMfx9wzcD+IWdjB3e22otGwWTBhwqSZAaC4ed5zM2BF/MF yDyT/0PkvwAAAP//AwBQSwECLQAUAAYACAAAACEAtoM4kv4AAADhAQAAEwAAAAAAAAAAAAAAAAAA AAAAW0NvbnRlbnRfVHlwZXNdLnhtbFBLAQItABQABgAIAAAAIQA4/SH/1gAAAJQBAAALAAAAAAAA AAAAAAAAAC8BAABfcmVscy8ucmVsc1BLAQItABQABgAIAAAAIQA8Xnp3bwIAAC0GAAAOAAAAAAAA AAAAAAAAAC4CAABkcnMvZTJvRG9jLnhtbFBLAQItABQABgAIAAAAIQCV4kjp4gAAAAwBAAAPAAAA AAAAAAAAAAAAAMkEAABkcnMvZG93bnJldi54bWxQSwUGAAAAAAQABADzAAAA2AUAAAAA ">
+                <v:shape id="Shape 4130" o:spid="_x0000_s1027" style="position:absolute;width:59816;height:95;visibility:visible;mso-wrap-style:square;v-text-anchor:top" coordsize="5981699,9525" o:gfxdata="UEsDBBQABgAIAAAAIQDb4fbL7gAAAIUBAAATAAAAW0NvbnRlbnRfVHlwZXNdLnhtbHyQz07DMAyH 70i8Q+QralM4IITa7kDhCAiNB7ASt43WOlEcyvb2pNu4IODoPz9/n1xv9vOkForiPDdwXVagiI23 jocG3rdPxR0oScgWJ8/UwIEENu3lRb09BBKV0ywNjCmFe63FjDSjlD4Q50nv44wpl3HQAc0OB9I3 VXWrjedEnIq03oC27qjHjympx31un0wiTQLq4bS4shrAECZnMGVTvbD9QSnOhDInjzsyuiBXWQP0 r4R18jfgnHvJr4nOknrFmJ5xzhraRtHWf3Kkpfz/yGo5S+H73hkquyhdjr3R8m2lj09svwAAAP// AwBQSwMEFAAGAAgAAAAhAFr0LFu/AAAAFQEAAAsAAABfcmVscy8ucmVsc2zPwWrDMAwG4Ptg72B0 X5TuUMaI01uh19I+gLGVxCy2jGSy9e1nemrHjpL4P0nD4SetZiPRyNnCruvBUPYcYp4tXC/Htw8w Wl0ObuVMFm6kcBhfX4Yzra62kC6xqGlKVgtLreUTUf1CyWnHhXKbTCzJ1VbKjMX5LzcTvvf9HuXR gPHJNKdgQU5hB+ZyK23zHztFL6w81c5zQp6m6P9TMfB3PtPWFCczVQtB9N4U2rp2HOA44NMz4y8A AAD//wMAUEsDBBQABgAIAAAAIQDo3kZ4ygAAAOIAAAAPAAAAZHJzL2Rvd25yZXYueG1sRI/RasJA EEXfC/2HZYS+1U2s1BJdJbRVAqXQqh8wZMckmJ0N2a1J/XrnodCXgctwz+WsNqNr1YX60Hg2kE4T UMSltw1XBo6H7eMLqBCRLbaeycAvBdis7+9WmFk/8Ddd9rFSAuGQoYE6xi7TOpQ1OQxT3xHL7+R7 h1FiX2nb4yBw1+pZkjxrhw3LQo0dvdZUnvc/zsCueA+f1cK2s7zYuuEjzRfn65cxD5PxbSknX4KK NMb/xh+isAbm6ZNIiJLogF7fAAAA//8DAFBLAQItABQABgAIAAAAIQDb4fbL7gAAAIUBAAATAAAA AAAAAAAAAAAAAAAAAABbQ29udGVudF9UeXBlc10ueG1sUEsBAi0AFAAGAAgAAAAhAFr0LFu/AAAA FQEAAAsAAAAAAAAAAAAAAAAAHwEAAF9yZWxzLy5yZWxzUEsBAi0AFAAGAAgAAAAhAOjeRnjKAAAA 4gAAAA8AAAAAAAAAAAAAAAAABwIAAGRycy9kb3ducmV2LnhtbFBLBQYAAAAAAwADALcAAAD+AgAA AAA= " path="m,l5981699,r,9525l,9525,,e" fillcolor="black" stroked="f" strokeweight="0">
                   <v:stroke miterlimit="83231f" joinstyle="miter"/>
                   <v:path arrowok="t" textboxrect="0,0,5981699,9525"/>
                 </v:shape>
@@ -752,7 +587,7 @@
         <w:ind w:left="-5" w:right="0"/>
         <w:jc w:val="both"/>
       </w:pPr>
-      <w:hyperlink r:id="rId6" w:history="1">
+      <w:hyperlink r:id="rId7" w:history="1">
         <w:r>
           <w:rPr>
             <w:rStyle w:val="a3"/>
@@ -767,25 +602,7 @@
         <w:rPr>
           <w:i/>
         </w:rPr>
-        <w:t xml:space="preserve"> | Mar 2025 </w:t>
-      </w:r>
-      <w:r>
-        <w:rPr>
-          <w:i/>
-        </w:rPr>
-        <w:t>-</w:t>
-      </w:r>
-      <w:r>
-        <w:rPr>
-          <w:i/>
-        </w:rPr>
-        <w:t xml:space="preserve"> </w:t>
-      </w:r>
-      <w:r>
-        <w:rPr>
-          <w:i/>
-        </w:rPr>
-        <w:t>Present</w:t>
+        <w:t xml:space="preserve"> | Mar 2025 - May 2026</w:t>
       </w:r>
     </w:p>
     <w:p>
@@ -828,13 +645,7 @@
         <w:rPr>
           <w:bCs/>
         </w:rPr>
-        <w:t xml:space="preserve">Partnered with 15+ hiring managers, </w:t>
-      </w:r>
-      <w:r>
-        <w:rPr>
-          <w:bCs/>
-        </w:rPr>
-        <w:t>advising on talent market trends, salary benchmarks, and hiring feasibility, resulting in approximately 20% faster decision-making</w:t>
+        <w:t>Partnered with 15+ hiring managers, advising on talent market trends, salary benchmarks, and hiring feasibility, resulting in approximately 20% faster decision-making</w:t>
       </w:r>
     </w:p>
     <w:p>
@@ -1120,29 +931,16 @@
         <w:ind w:left="-5" w:right="0"/>
         <w:jc w:val="both"/>
       </w:pPr>
-      <w:r>
-        <w:fldChar w:fldCharType="begin"/>
-      </w:r>
-      <w:r>
-        <w:instrText>HYPERLINK "https://astondevs.ru/" \h</w:instrText>
-      </w:r>
-      <w:r>
-        <w:fldChar w:fldCharType="separate"/>
-      </w:r>
-      <w:r>
-        <w:rPr>
-          <w:i/>
-        </w:rPr>
-        <w:t>Aston</w:t>
-      </w:r>
-      <w:r>
-        <w:fldChar w:fldCharType="end"/>
-      </w:r>
-      <w:r>
-        <w:t xml:space="preserve"> </w:t>
-      </w:r>
-      <w:r>
-        <w:t xml:space="preserve">| </w:t>
+      <w:hyperlink r:id="rId8">
+        <w:r>
+          <w:rPr>
+            <w:i/>
+          </w:rPr>
+          <w:t>Aston</w:t>
+        </w:r>
+      </w:hyperlink>
+      <w:r>
+        <w:t xml:space="preserve"> | </w:t>
       </w:r>
       <w:r>
         <w:rPr>
@@ -1155,7 +953,6 @@
         <w:rPr>
           <w:i/>
           <w:iCs/>
-          <w:lang w:val="ru-RU"/>
         </w:rPr>
         <w:t>-</w:t>
       </w:r>
@@ -1409,7 +1206,6 @@
       <w:r>
         <w:rPr>
           <w:i/>
-          <w:lang w:val="ru-RU"/>
         </w:rPr>
         <w:t>-</w:t>
       </w:r>
@@ -1521,6 +1317,7 @@
         <w:t>Maintained 90%+ probation success rate across placements</w:t>
       </w:r>
     </w:p>
+    <w:bookmarkStart w:id="0" w:name="_Hlk230510729"/>
     <w:p>
       <w:pPr>
         <w:pStyle w:val="1"/>
@@ -1611,7 +1408,7 @@
           </mc:Choice>
           <mc:Fallback>
             <w:pict>
-              <v:shape w14:anchorId="3F2ADCB4" id="Shape 4132" o:spid="_x0000_s1026" style="position:absolute;margin-left:-.35pt;margin-top:16.1pt;width:471pt;height:.75pt;z-index:-251654144;visibility:visible;mso-wrap-style:square;mso-wrap-distance-left:9pt;mso-wrap-distance-top:0;mso-wrap-distance-right:9pt;mso-wrap-distance-bottom:0;mso-position-horizontal:absolute;mso-position-horizontal-relative:text;mso-position-vertical:absolute;mso-position-vertical-relative:text;v-text-anchor:top" coordsize="5981699,9525" o:gfxdata="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" path="m,l5981699,r,9525l,9525,,e" fillcolor="black" stroked="f" strokeweight="0">
+              <v:shape w14:anchorId="3F2ADCB4" id="Shape 4132" o:spid="_x0000_s1026" style="position:absolute;margin-left:-.35pt;margin-top:16.1pt;width:471pt;height:.75pt;z-index:-251654144;visibility:visible;mso-wrap-style:square;mso-wrap-distance-left:9pt;mso-wrap-distance-top:0;mso-wrap-distance-right:9pt;mso-wrap-distance-bottom:0;mso-position-horizontal:absolute;mso-position-horizontal-relative:text;mso-position-vertical:absolute;mso-position-vertical-relative:text;v-text-anchor:top" coordsize="5981699,9525" o:gfxdata="UEsDBBQABgAIAAAAIQC2gziS/gAAAOEBAAATAAAAW0NvbnRlbnRfVHlwZXNdLnhtbJSRQU7DMBBF 90jcwfIWJU67QAgl6YK0S0CoHGBkTxKLZGx5TGhvj5O2G0SRWNoz/78nu9wcxkFMGNg6quQqL6RA 0s5Y6ir5vt9lD1JwBDIwOMJKHpHlpr69KfdHjyxSmriSfYz+USnWPY7AufNIadK6MEJMx9ApD/oD OlTrorhX2lFEilmcO2RdNtjC5xDF9pCuTyYBB5bi6bQ4syoJ3g9WQ0ymaiLzg5KdCXlKLjvcW893 SUOqXwnz5DrgnHtJTxOsQfEKIT7DmDSUCaxw7Rqn8787ZsmRM9e2VmPeBN4uqYvTtW7jvijg9N/y JsXecLq0q+WD6m8AAAD//wMAUEsDBBQABgAIAAAAIQA4/SH/1gAAAJQBAAALAAAAX3JlbHMvLnJl bHOkkMFqwzAMhu+DvYPRfXGawxijTi+j0GvpHsDYimMaW0Yy2fr2M4PBMnrbUb/Q94l/f/hMi1qR JVI2sOt6UJgd+ZiDgffL8ekFlFSbvV0oo4EbChzGx4f9GRdb25HMsYhqlCwG5lrLq9biZkxWOiqY 22YiTra2kYMu1l1tQD30/bPm3wwYN0x18gb45AdQl1tp5j/sFB2T0FQ7R0nTNEV3j6o9feQzro1i OWA14Fm+Q8a1a8+Bvu/d/dMb2JY5uiPbhG/ktn4cqGU/er3pcvwCAAD//wMAUEsDBBQABgAIAAAA IQAj6nQAGgIAAP0EAAAOAAAAZHJzL2Uyb0RvYy54bWysVE2P0zAQvSPxH6zcadJKXbZR0z2wggsC xC4/wHXsxpK/ZHuT9t8znsRJWBAHRA72xDPzPO/Z4+PDVSvScx+kNU2x3VQF4YbZVppLU/x4/vju viAhUtNSZQ1vihsPxcPp7Zvj4Gq+s51VLfcEQEyoB9cUXYyuLsvAOq5p2FjHDTiF9ZpG+PWXsvV0 AHStyl1V3ZWD9a3zlvEQYPVxdBYnxBeCs/hViMAjUU0BtUUcPY7nNJanI60vnrpOsqkM+g9VaCoN bDpDPdJIyYuXv0FpybwNVsQNs7q0QkjGkQOw2Vav2Dx11HHkAuIEN8sU/h8s+9I/uW8eZBhcqAOY icVVeJ1mqI9cUazbLBa/RsJgcX+4394dDgVh4Dvsd/ukZbnkspcQP3GLOLT/HOIodZst2mWLXU02 PRzYX4/K0ZjyUnHJJMOqkG6qIzm17fmzxbD4igLUuHiVWUfNnDJdiM0ReXaIt45ckc9BeR6D4eL9 qlF253kdhndy3heMxBOVnbnD4lpdZZIMsAmj0EFC0YhXUcsIraWkhr7cva+qBRjQltNGK94UT2Ip 850LIls89LQQ/OX8QXnS09RA+CE4Va6j0+p08FMoloo4KV9IpWbILab+CXK8OlNwyuPYu3NmNWay qZqxgeGFAdK5jUGUOQl3tibO+QYeHyxzxTaZZ9ve8PajINBjWP30HqQmXv+jbMurdfoJAAD//wMA UEsDBBQABgAIAAAAIQAvWeyo4QAAAAwBAAAPAAAAZHJzL2Rvd25yZXYueG1sTE/bSsNAEH0X/Idl BN/azUWMptmUoFYKRdDqB2yzYxKanQ3ZbRP9escnfRmYOWfOpVjPthdnHH3nSEG8jEAg1c501Cj4 eN8s7kD4oMno3hEq+EIP6/LyotC5cRO94XkfGsEi5HOtoA1hyKX0dYtW+6UbkBj7dKPVgdexkWbU E4vbXiZRdCut7ogdWj3gQ4v1cX+yCp63T/6lyUyfVNuNnXZxlR2/X5W6vpofVzyqFYiAc/j7gN8O nB9KDnZwJzJe9AoWGRMVpEkCguH7mzgFceBDmoEsC/m/RPkDAAD//wMAUEsBAi0AFAAGAAgAAAAh ALaDOJL+AAAA4QEAABMAAAAAAAAAAAAAAAAAAAAAAFtDb250ZW50X1R5cGVzXS54bWxQSwECLQAU AAYACAAAACEAOP0h/9YAAACUAQAACwAAAAAAAAAAAAAAAAAvAQAAX3JlbHMvLnJlbHNQSwECLQAU AAYACAAAACEAI+p0ABoCAAD9BAAADgAAAAAAAAAAAAAAAAAuAgAAZHJzL2Uyb0RvYy54bWxQSwEC LQAUAAYACAAAACEAL1nsqOEAAAAMAQAADwAAAAAAAAAAAAAAAAB0BAAAZHJzL2Rvd25yZXYueG1s UEsFBgAAAAAEAAQA8wAAAIIFAAAAAA== " path="m,l5981699,r,9525l,9525,,e" fillcolor="black" stroked="f" strokeweight="0">
                 <v:stroke miterlimit="83231f" joinstyle="miter"/>
                 <v:path arrowok="t" textboxrect="0,0,5981699,9525"/>
               </v:shape>
@@ -1623,6 +1420,7 @@
         <w:t>Education</w:t>
       </w:r>
     </w:p>
+    <w:bookmarkEnd w:id="0"/>
     <w:p>
       <w:pPr>
         <w:tabs>
@@ -1632,15 +1430,25 @@
         <w:ind w:left="-15" w:right="0" w:firstLine="0"/>
         <w:jc w:val="both"/>
       </w:pPr>
-      <w:hyperlink r:id="rId7">
-        <w:r>
-          <w:rPr>
-            <w:b/>
-          </w:rPr>
-          <w:t>Moscow</w:t>
-        </w:r>
-      </w:hyperlink>
-      <w:hyperlink r:id="rId8">
+      <w:r>
+        <w:fldChar w:fldCharType="begin"/>
+      </w:r>
+      <w:r>
+        <w:instrText>HYPERLINK "https://mi.university/" \h</w:instrText>
+      </w:r>
+      <w:r>
+        <w:fldChar w:fldCharType="separate"/>
+      </w:r>
+      <w:r>
+        <w:rPr>
+          <w:b/>
+        </w:rPr>
+        <w:t>Moscow</w:t>
+      </w:r>
+      <w:r>
+        <w:fldChar w:fldCharType="end"/>
+      </w:r>
+      <w:hyperlink r:id="rId9">
         <w:r>
           <w:rPr>
             <w:b/>
@@ -1648,7 +1456,7 @@
           <w:t xml:space="preserve"> International</w:t>
         </w:r>
       </w:hyperlink>
-      <w:hyperlink r:id="rId9">
+      <w:hyperlink r:id="rId10">
         <w:r>
           <w:rPr>
             <w:b/>
@@ -1662,28 +1470,175 @@
         <w:tabs>
           <w:tab w:val="center" w:pos="6477"/>
         </w:tabs>
-        <w:spacing w:after="30" w:line="240" w:lineRule="auto"/>
+        <w:spacing w:after="270" w:line="240" w:lineRule="auto"/>
         <w:ind w:left="0" w:right="0" w:firstLine="0"/>
         <w:jc w:val="both"/>
       </w:pPr>
       <w:r>
-        <w:t>Bachelor</w:t>
-      </w:r>
-      <w:r>
-        <w:t>'</w:t>
-      </w:r>
-      <w:r>
-        <w:t xml:space="preserve">s Degree in Business Administration (Management &amp; Operations) | 2018 </w:t>
-      </w:r>
-      <w:r>
-        <w:t>-</w:t>
-      </w:r>
-      <w:r>
-        <w:t xml:space="preserve"> 2022</w:t>
-      </w:r>
-      <w:r>
-        <w:t xml:space="preserve"> | Moscow</w:t>
-      </w:r>
+        <w:t>Bachelor's Degree in Business Administration (Management &amp; Operations) | 2018 - 2022 | Moscow</w:t>
+      </w:r>
+    </w:p>
+    <w:p>
+      <w:pPr>
+        <w:pStyle w:val="1"/>
+        <w:spacing w:after="64" w:line="240" w:lineRule="auto"/>
+        <w:ind w:left="11" w:hanging="11"/>
+        <w:jc w:val="both"/>
+        <w:rPr>
+          <w:lang w:val="en-US"/>
+        </w:rPr>
+      </w:pPr>
+      <w:r>
+        <w:rPr>
+          <w:bCs/>
+          <w:noProof/>
+        </w:rPr>
+        <mc:AlternateContent>
+          <mc:Choice Requires="wps">
+            <w:drawing>
+              <wp:anchor distT="0" distB="0" distL="114300" distR="114300" simplePos="0" relativeHeight="251672576" behindDoc="1" locked="0" layoutInCell="1" allowOverlap="1" wp14:anchorId="7CC7D3B5" wp14:editId="1911C469">
+                <wp:simplePos x="0" y="0"/>
+                <wp:positionH relativeFrom="column">
+                  <wp:posOffset>-4682</wp:posOffset>
+                </wp:positionH>
+                <wp:positionV relativeFrom="paragraph">
+                  <wp:posOffset>204776</wp:posOffset>
+                </wp:positionV>
+                <wp:extent cx="5981699" cy="9525"/>
+                <wp:effectExtent l="0" t="0" r="635" b="3175"/>
+                <wp:wrapNone/>
+                <wp:docPr id="603896841" name="Shape 4132"/>
+                <wp:cNvGraphicFramePr/>
+                <a:graphic xmlns:a="http://schemas.openxmlformats.org/drawingml/2006/main">
+                  <a:graphicData uri="http://schemas.microsoft.com/office/word/2010/wordprocessingShape">
+                    <wps:wsp>
+                      <wps:cNvSpPr/>
+                      <wps:spPr>
+                        <a:xfrm>
+                          <a:off x="0" y="0"/>
+                          <a:ext cx="5981699" cy="9525"/>
+                        </a:xfrm>
+                        <a:custGeom>
+                          <a:avLst/>
+                          <a:gdLst/>
+                          <a:ahLst/>
+                          <a:cxnLst/>
+                          <a:rect l="0" t="0" r="0" b="0"/>
+                          <a:pathLst>
+                            <a:path w="5981699" h="9525">
+                              <a:moveTo>
+                                <a:pt x="0" y="0"/>
+                              </a:moveTo>
+                              <a:lnTo>
+                                <a:pt x="5981699" y="0"/>
+                              </a:lnTo>
+                              <a:lnTo>
+                                <a:pt x="5981699" y="9525"/>
+                              </a:lnTo>
+                              <a:lnTo>
+                                <a:pt x="0" y="9525"/>
+                              </a:lnTo>
+                              <a:lnTo>
+                                <a:pt x="0" y="0"/>
+                              </a:lnTo>
+                            </a:path>
+                          </a:pathLst>
+                        </a:custGeom>
+                        <a:ln w="0" cap="flat">
+                          <a:miter lim="127000"/>
+                        </a:ln>
+                      </wps:spPr>
+                      <wps:style>
+                        <a:lnRef idx="0">
+                          <a:srgbClr val="000000">
+                            <a:alpha val="0"/>
+                          </a:srgbClr>
+                        </a:lnRef>
+                        <a:fillRef idx="1">
+                          <a:srgbClr val="000000"/>
+                        </a:fillRef>
+                        <a:effectRef idx="0">
+                          <a:scrgbClr r="0" g="0" b="0"/>
+                        </a:effectRef>
+                        <a:fontRef idx="none"/>
+                      </wps:style>
+                      <wps:bodyPr/>
+                    </wps:wsp>
+                  </a:graphicData>
+                </a:graphic>
+              </wp:anchor>
+            </w:drawing>
+          </mc:Choice>
+          <mc:Fallback>
+            <w:pict>
+              <v:shape w14:anchorId="37AA261B" id="Shape 4132" o:spid="_x0000_s1026" style="position:absolute;margin-left:-.35pt;margin-top:16.1pt;width:471pt;height:.75pt;z-index:-251643904;visibility:visible;mso-wrap-style:square;mso-wrap-distance-left:9pt;mso-wrap-distance-top:0;mso-wrap-distance-right:9pt;mso-wrap-distance-bottom:0;mso-position-horizontal:absolute;mso-position-horizontal-relative:text;mso-position-vertical:absolute;mso-position-vertical-relative:text;v-text-anchor:top" coordsize="5981699,9525" o:gfxdata="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" path="m,l5981699,r,9525l,9525,,e" fillcolor="black" stroked="f" strokeweight="0">
+                <v:stroke miterlimit="83231f" joinstyle="miter"/>
+                <v:path arrowok="t" textboxrect="0,0,5981699,9525"/>
+              </v:shape>
+            </w:pict>
+          </mc:Fallback>
+        </mc:AlternateContent>
+      </w:r>
+      <w:r>
+        <w:rPr>
+          <w:lang w:val="en-US"/>
+        </w:rPr>
+        <w:t>Certificates</w:t>
+      </w:r>
+    </w:p>
+    <w:p>
+      <w:pPr>
+        <w:pStyle w:val="a6"/>
+        <w:numPr>
+          <w:ilvl w:val="0"/>
+          <w:numId w:val="12"/>
+        </w:numPr>
+        <w:spacing w:after="0" w:line="240" w:lineRule="auto"/>
+        <w:ind w:left="284" w:right="0" w:hanging="284"/>
+      </w:pPr>
+      <w:r>
+        <w:t>Performance Review Specialist | Jan 29, 2025 | Aston</w:t>
+      </w:r>
+    </w:p>
+    <w:p>
+      <w:pPr>
+        <w:pStyle w:val="a6"/>
+        <w:numPr>
+          <w:ilvl w:val="0"/>
+          <w:numId w:val="12"/>
+        </w:numPr>
+        <w:spacing w:after="0" w:line="240" w:lineRule="auto"/>
+        <w:ind w:left="284" w:right="0" w:hanging="284"/>
+      </w:pPr>
+      <w:r>
+        <w:t xml:space="preserve">IT </w:t>
+      </w:r>
+      <w:proofErr w:type="spellStart"/>
+      <w:r>
+        <w:t>Sourcer</w:t>
+      </w:r>
+      <w:proofErr w:type="spellEnd"/>
+      <w:r>
+        <w:t xml:space="preserve"> | Dec 1, 2023 | Aston</w:t>
+      </w:r>
+    </w:p>
+    <w:p>
+      <w:pPr>
+        <w:pStyle w:val="a6"/>
+        <w:numPr>
+          <w:ilvl w:val="0"/>
+          <w:numId w:val="12"/>
+        </w:numPr>
+        <w:spacing w:after="270" w:line="240" w:lineRule="auto"/>
+        <w:ind w:left="284" w:right="0" w:hanging="284"/>
+      </w:pPr>
+      <w:bookmarkStart w:id="1" w:name="OLE_LINK1"/>
+      <w:bookmarkStart w:id="2" w:name="_Hlk230510470"/>
+      <w:r>
+        <w:t>IT-RECRUITMENT CERTIFICATION COURSE | Sep 5, 2023 | HRPR</w:t>
+      </w:r>
+      <w:bookmarkEnd w:id="1"/>
+      <w:bookmarkEnd w:id="2"/>
     </w:p>
     <w:p>
       <w:pPr>
@@ -1793,8 +1748,8 @@
           </mc:Choice>
           <mc:Fallback>
             <w:pict>
-              <v:group w14:anchorId="562E90A9" id="Group 3498" o:spid="_x0000_s1026" style="position:absolute;margin-left:-.35pt;margin-top:16.8pt;width:470.95pt;height:.75pt;z-index:-251650048" coordsize="59816,95" o:gfxdata="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">
-                <v:shape id="Shape 4136" o:spid="_x0000_s1027" style="position:absolute;width:59816;height:95;visibility:visible;mso-wrap-style:square;v-text-anchor:top" coordsize="5981699,9525" o:gfxdata="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" path="m,l5981699,r,9525l,9525,,e" fillcolor="black" stroked="f" strokeweight="0">
+              <v:group w14:anchorId="562E90A9" id="Group 3498" o:spid="_x0000_s1026" style="position:absolute;margin-left:-.35pt;margin-top:16.8pt;width:470.95pt;height:.75pt;z-index:-251650048" coordsize="59816,95" o:gfxdata="UEsDBBQABgAIAAAAIQC2gziS/gAAAOEBAAATAAAAW0NvbnRlbnRfVHlwZXNdLnhtbJSRQU7DMBBF 90jcwfIWJU67QAgl6YK0S0CoHGBkTxKLZGx5TGhvj5O2G0SRWNoz/78nu9wcxkFMGNg6quQqL6RA 0s5Y6ir5vt9lD1JwBDIwOMJKHpHlpr69KfdHjyxSmriSfYz+USnWPY7AufNIadK6MEJMx9ApD/oD OlTrorhX2lFEilmcO2RdNtjC5xDF9pCuTyYBB5bi6bQ4syoJ3g9WQ0ymaiLzg5KdCXlKLjvcW893 SUOqXwnz5DrgnHtJTxOsQfEKIT7DmDSUCaxw7Rqn8787ZsmRM9e2VmPeBN4uqYvTtW7jvijg9N/y JsXecLq0q+WD6m8AAAD//wMAUEsDBBQABgAIAAAAIQA4/SH/1gAAAJQBAAALAAAAX3JlbHMvLnJl bHOkkMFqwzAMhu+DvYPRfXGawxijTi+j0GvpHsDYimMaW0Yy2fr2M4PBMnrbUb/Q94l/f/hMi1qR JVI2sOt6UJgd+ZiDgffL8ekFlFSbvV0oo4EbChzGx4f9GRdb25HMsYhqlCwG5lrLq9biZkxWOiqY 22YiTra2kYMu1l1tQD30/bPm3wwYN0x18gb45AdQl1tp5j/sFB2T0FQ7R0nTNEV3j6o9feQzro1i OWA14Fm+Q8a1a8+Bvu/d/dMb2JY5uiPbhG/ktn4cqGU/er3pcvwCAAD//wMAUEsDBBQABgAIAAAA IQAOguH+cAIAAC0GAAAOAAAAZHJzL2Uyb0RvYy54bWykVNuO0zAQfUfiH6y806SFlm3UdB9Y6AuC Fbt8gOvYSSTfZLtN+/eMJ5dmuyyIpQ/pxJ45mXM8Ppvbk5LkyJ1vjC6S+SxLCNfMlI2uiuTn45d3 NwnxgeqSSqN5kZy5T263b99sWpvzhamNLLkjAKJ93toiqUOweZp6VnNF/cxYrmFTGKdogFdXpaWj LaArmS6ybJW2xpXWGca9h9W7bjPZIr4QnIXvQngeiCwS6C3g0+FzH5/pdkPzylFbN6xvg76iC0Ub DR8doe5ooOTgmmdQqmHOeCPCjBmVGiEaxpEDsJlnV2x2zhwscqnytrKjTCDtlU6vhmXfjjtnH+y9 AyVaW4EW+Ba5nIRT8R+6JCeU7DxKxk+BMFhcrm/m2WqZEAZ76+Vi2SnKapD9WRGrP0/KVuv107J0 +GT6pJHWwmj4C3v/f+wfamo5iupzYH/vSFMWyYf5+1VCNFUwo5hBcAVFwbxRIp97UOtf9HmZKM3Z wYcdN6gzPX71oRvIcohoPUTspIfQwVj/caAtDbEuNhlD0nYHhY3U/TnFTWWO/NFgWrg6LTiMy67U 06x45gg1jAPkDhnDv0W8aeYwHC8mw/WczNBf0vDmjjkQRJ7bTR8gd4in6kodZYCPMAo+IyQNeGFV E8CAZKPAvRYfs+wCDGhx9LrTxiicJY9iSf2DCxgbvBRxwbtq/0k6cqTRZvCH4FTamvar8WJAS30q xogT60Uj5Qg5x9LfQXYIfXKs4+hwY2XWVbK+m87mwCyA9GB20MFYhF82Ooz1Giwa25ywjeHelGc0 CBQE7iJKg56EPHr/jKY3fcesi8tvfwEAAP//AwBQSwMEFAAGAAgAAAAhAFeKoynjAAAADAEAAA8A AABkcnMvZG93bnJldi54bWxMT01vwjAMvU/af4g8aTdIQwfbSlOE2McJTRpMmnYLrWkrGqdqQlv+ /cxpu1iy3/P7SFejbUSPna8daVDTCARS7oqaSg1f+7fJEwgfDBWmcYQaLuhhld3epCYp3ECf2O9C KViEfGI0VCG0iZQ+r9AaP3UtEmNH11kTeO1KWXRmYHHbyFkULaQ1NbFDZVrcVJifdmer4X0wwzpW r/32dNxcfvbzj++tQq3v78aXJY/1EkTAMfx9wLUD54eMgx3cmQovGg2TRyZqiOMFCIafH9QMxIEP cwUyS+X/EtkvAAAA//8DAFBLAQItABQABgAIAAAAIQC2gziS/gAAAOEBAAATAAAAAAAAAAAAAAAA AAAAAABbQ29udGVudF9UeXBlc10ueG1sUEsBAi0AFAAGAAgAAAAhADj9If/WAAAAlAEAAAsAAAAA AAAAAAAAAAAALwEAAF9yZWxzLy5yZWxzUEsBAi0AFAAGAAgAAAAhAA6C4f5wAgAALQYAAA4AAAAA AAAAAAAAAAAALgIAAGRycy9lMm9Eb2MueG1sUEsBAi0AFAAGAAgAAAAhAFeKoynjAAAADAEAAA8A AAAAAAAAAAAAAAAAygQAAGRycy9kb3ducmV2LnhtbFBLBQYAAAAABAAEAPMAAADaBQAAAAA= ">
+                <v:shape id="Shape 4136" o:spid="_x0000_s1027" style="position:absolute;width:59816;height:95;visibility:visible;mso-wrap-style:square;v-text-anchor:top" coordsize="5981699,9525" o:gfxdata="UEsDBBQABgAIAAAAIQDb4fbL7gAAAIUBAAATAAAAW0NvbnRlbnRfVHlwZXNdLnhtbHyQz07DMAyH 70i8Q+QralM4IITa7kDhCAiNB7ASt43WOlEcyvb2pNu4IODoPz9/n1xv9vOkForiPDdwXVagiI23 jocG3rdPxR0oScgWJ8/UwIEENu3lRb09BBKV0ywNjCmFe63FjDSjlD4Q50nv44wpl3HQAc0OB9I3 VXWrjedEnIq03oC27qjHjympx31un0wiTQLq4bS4shrAECZnMGVTvbD9QSnOhDInjzsyuiBXWQP0 r4R18jfgnHvJr4nOknrFmJ5xzhraRtHWf3Kkpfz/yGo5S+H73hkquyhdjr3R8m2lj09svwAAAP// AwBQSwMEFAAGAAgAAAAhAFr0LFu/AAAAFQEAAAsAAABfcmVscy8ucmVsc2zPwWrDMAwG4Ptg72B0 X5TuUMaI01uh19I+gLGVxCy2jGSy9e1nemrHjpL4P0nD4SetZiPRyNnCruvBUPYcYp4tXC/Htw8w Wl0ObuVMFm6kcBhfX4Yzra62kC6xqGlKVgtLreUTUf1CyWnHhXKbTCzJ1VbKjMX5LzcTvvf9HuXR gPHJNKdgQU5hB+ZyK23zHztFL6w81c5zQp6m6P9TMfB3PtPWFCczVQtB9N4U2rp2HOA44NMz4y8A AAD//wMAUEsDBBQABgAIAAAAIQAIe3uXygAAAOIAAAAPAAAAZHJzL2Rvd25yZXYueG1sRI/dasJA FITvC77DcoTe1U2sqERXCVolUAr15wEO2WMSzJ4N2dWkPr1bKPRmYBjmG2a57k0t7tS6yrKCeBSB IM6trrhQcD7t3uYgnEfWWFsmBT/kYL0avCwx0bbjA92PvhABwi5BBaX3TSKly0sy6Ea2IQ7ZxbYG fbBtIXWLXYCbWo6jaCoNVhwWSmxoU1J+Pd6Mgn324b6Kma7HabYz3Weczq6Pb6Veh/12ESRdgPDU +//GHyLTCibx+xR+L4U7IFdPAAAA//8DAFBLAQItABQABgAIAAAAIQDb4fbL7gAAAIUBAAATAAAA AAAAAAAAAAAAAAAAAABbQ29udGVudF9UeXBlc10ueG1sUEsBAi0AFAAGAAgAAAAhAFr0LFu/AAAA FQEAAAsAAAAAAAAAAAAAAAAAHwEAAF9yZWxzLy5yZWxzUEsBAi0AFAAGAAgAAAAhAAh7e5fKAAAA 4gAAAA8AAAAAAAAAAAAAAAAABwIAAGRycy9kb3ducmV2LnhtbFBLBQYAAAAAAwADALcAAAD+AgAA AAA= " path="m,l5981699,r,9525l,9525,,e" fillcolor="black" stroked="f" strokeweight="0">
                   <v:stroke miterlimit="83231f" joinstyle="miter"/>
                   <v:path arrowok="t" textboxrect="0,0,5981699,9525"/>
                 </v:shape>
@@ -4208,6 +4163,7 @@
   <w:style w:type="character" w:customStyle="1" w:styleId="10">
     <w:name w:val="Заголовок 1 Знак"/>
     <w:link w:val="1"/>
+    <w:uiPriority w:val="9"/>
     <w:rPr>
       <w:rFonts w:ascii="Calibri" w:eastAsia="Calibri" w:hAnsi="Calibri" w:cs="Calibri"/>
       <w:b/>

</xml_diff>

<commit_message>
Update language levels: English Intermediate (B1), Russian Native speaker
</commit_message>
<xml_diff>
--- a/Alesia_Zayats_CV.docx
+++ b/Alesia_Zayats_CV.docx
@@ -43,18 +43,22 @@
         <w:ind w:left="0" w:right="0" w:firstLine="0"/>
         <w:jc w:val="center"/>
       </w:pPr>
+      <w:r>
+        <w:fldChar w:fldCharType="begin"/>
+        <w:instrText>HYPERLINK "mailto:alesiaromasko19@gmail.com"</w:instrText>
+        <w:fldChar w:fldCharType="separate"/>
+      </w:r>
+      <w:r>
+        <w:rPr>
+          <w:rStyle w:val="a3"/>
+        </w:rPr>
+        <w:t>alesiaromasko19@gmail.com</w:t>
+      </w:r>
+      <w:r>
+        <w:fldChar w:fldCharType="end"/>
+        <w:t xml:space="preserve"> | +375298508516 | Belarus, Minsk | linkedin: </w:t>
+      </w:r>
       <w:hyperlink r:id="rId5" w:history="1">
-        <w:r>
-          <w:rPr>
-            <w:rStyle w:val="a3"/>
-          </w:rPr>
-          <w:t>alesiaromasko19@gmail.com</w:t>
-        </w:r>
-      </w:hyperlink>
-      <w:r>
-        <w:t xml:space="preserve"> | +375298508516 | Belarus, Minsk | linkedin: </w:t>
-      </w:r>
-      <w:hyperlink r:id="rId6" w:history="1">
         <w:r>
           <w:rPr>
             <w:rStyle w:val="a3"/>
@@ -587,7 +591,7 @@
         <w:ind w:left="-5" w:right="0"/>
         <w:jc w:val="both"/>
       </w:pPr>
-      <w:hyperlink r:id="rId7" w:history="1">
+      <w:hyperlink r:id="rId6" w:history="1">
         <w:r>
           <w:rPr>
             <w:rStyle w:val="a3"/>
@@ -931,15 +935,19 @@
         <w:ind w:left="-5" w:right="0"/>
         <w:jc w:val="both"/>
       </w:pPr>
-      <w:hyperlink r:id="rId8">
-        <w:r>
-          <w:rPr>
-            <w:i/>
-          </w:rPr>
-          <w:t>Aston</w:t>
-        </w:r>
-      </w:hyperlink>
-      <w:r>
+      <w:r>
+        <w:fldChar w:fldCharType="begin"/>
+        <w:instrText>HYPERLINK "https://astondevs.ru/" \h</w:instrText>
+        <w:fldChar w:fldCharType="separate"/>
+      </w:r>
+      <w:r>
+        <w:rPr>
+          <w:i/>
+        </w:rPr>
+        <w:t>Aston</w:t>
+      </w:r>
+      <w:r>
+        <w:fldChar w:fldCharType="end"/>
         <w:t xml:space="preserve"> | </w:t>
       </w:r>
       <w:r>
@@ -953,6 +961,7 @@
         <w:rPr>
           <w:i/>
           <w:iCs/>
+          <w:lang w:val="ru-RU"/>
         </w:rPr>
         <w:t>-</w:t>
       </w:r>
@@ -1206,6 +1215,7 @@
       <w:r>
         <w:rPr>
           <w:i/>
+          <w:lang w:val="ru-RU"/>
         </w:rPr>
         <w:t>-</w:t>
       </w:r>
@@ -1317,7 +1327,6 @@
         <w:t>Maintained 90%+ probation success rate across placements</w:t>
       </w:r>
     </w:p>
-    <w:bookmarkStart w:id="0" w:name="_Hlk230510729"/>
     <w:p>
       <w:pPr>
         <w:pStyle w:val="1"/>
@@ -1420,7 +1429,6 @@
         <w:t>Education</w:t>
       </w:r>
     </w:p>
-    <w:bookmarkEnd w:id="0"/>
     <w:p>
       <w:pPr>
         <w:tabs>
@@ -1430,25 +1438,15 @@
         <w:ind w:left="-15" w:right="0" w:firstLine="0"/>
         <w:jc w:val="both"/>
       </w:pPr>
-      <w:r>
-        <w:fldChar w:fldCharType="begin"/>
-      </w:r>
-      <w:r>
-        <w:instrText>HYPERLINK "https://mi.university/" \h</w:instrText>
-      </w:r>
-      <w:r>
-        <w:fldChar w:fldCharType="separate"/>
-      </w:r>
-      <w:r>
-        <w:rPr>
-          <w:b/>
-        </w:rPr>
-        <w:t>Moscow</w:t>
-      </w:r>
-      <w:r>
-        <w:fldChar w:fldCharType="end"/>
-      </w:r>
-      <w:hyperlink r:id="rId9">
+      <w:hyperlink r:id="rId7">
+        <w:r>
+          <w:rPr>
+            <w:b/>
+          </w:rPr>
+          <w:t>Moscow</w:t>
+        </w:r>
+      </w:hyperlink>
+      <w:hyperlink r:id="rId8">
         <w:r>
           <w:rPr>
             <w:b/>
@@ -1456,7 +1454,7 @@
           <w:t xml:space="preserve"> International</w:t>
         </w:r>
       </w:hyperlink>
-      <w:hyperlink r:id="rId10">
+      <w:hyperlink r:id="rId9">
         <w:r>
           <w:rPr>
             <w:b/>
@@ -1470,175 +1468,13 @@
         <w:tabs>
           <w:tab w:val="center" w:pos="6477"/>
         </w:tabs>
-        <w:spacing w:after="270" w:line="240" w:lineRule="auto"/>
+        <w:spacing w:after="30" w:line="240" w:lineRule="auto"/>
         <w:ind w:left="0" w:right="0" w:firstLine="0"/>
         <w:jc w:val="both"/>
       </w:pPr>
       <w:r>
         <w:t>Bachelor's Degree in Business Administration (Management &amp; Operations) | 2018 - 2022 | Moscow</w:t>
       </w:r>
-    </w:p>
-    <w:p>
-      <w:pPr>
-        <w:pStyle w:val="1"/>
-        <w:spacing w:after="64" w:line="240" w:lineRule="auto"/>
-        <w:ind w:left="11" w:hanging="11"/>
-        <w:jc w:val="both"/>
-        <w:rPr>
-          <w:lang w:val="en-US"/>
-        </w:rPr>
-      </w:pPr>
-      <w:r>
-        <w:rPr>
-          <w:bCs/>
-          <w:noProof/>
-        </w:rPr>
-        <mc:AlternateContent>
-          <mc:Choice Requires="wps">
-            <w:drawing>
-              <wp:anchor distT="0" distB="0" distL="114300" distR="114300" simplePos="0" relativeHeight="251672576" behindDoc="1" locked="0" layoutInCell="1" allowOverlap="1" wp14:anchorId="7CC7D3B5" wp14:editId="1911C469">
-                <wp:simplePos x="0" y="0"/>
-                <wp:positionH relativeFrom="column">
-                  <wp:posOffset>-4682</wp:posOffset>
-                </wp:positionH>
-                <wp:positionV relativeFrom="paragraph">
-                  <wp:posOffset>204776</wp:posOffset>
-                </wp:positionV>
-                <wp:extent cx="5981699" cy="9525"/>
-                <wp:effectExtent l="0" t="0" r="635" b="3175"/>
-                <wp:wrapNone/>
-                <wp:docPr id="603896841" name="Shape 4132"/>
-                <wp:cNvGraphicFramePr/>
-                <a:graphic xmlns:a="http://schemas.openxmlformats.org/drawingml/2006/main">
-                  <a:graphicData uri="http://schemas.microsoft.com/office/word/2010/wordprocessingShape">
-                    <wps:wsp>
-                      <wps:cNvSpPr/>
-                      <wps:spPr>
-                        <a:xfrm>
-                          <a:off x="0" y="0"/>
-                          <a:ext cx="5981699" cy="9525"/>
-                        </a:xfrm>
-                        <a:custGeom>
-                          <a:avLst/>
-                          <a:gdLst/>
-                          <a:ahLst/>
-                          <a:cxnLst/>
-                          <a:rect l="0" t="0" r="0" b="0"/>
-                          <a:pathLst>
-                            <a:path w="5981699" h="9525">
-                              <a:moveTo>
-                                <a:pt x="0" y="0"/>
-                              </a:moveTo>
-                              <a:lnTo>
-                                <a:pt x="5981699" y="0"/>
-                              </a:lnTo>
-                              <a:lnTo>
-                                <a:pt x="5981699" y="9525"/>
-                              </a:lnTo>
-                              <a:lnTo>
-                                <a:pt x="0" y="9525"/>
-                              </a:lnTo>
-                              <a:lnTo>
-                                <a:pt x="0" y="0"/>
-                              </a:lnTo>
-                            </a:path>
-                          </a:pathLst>
-                        </a:custGeom>
-                        <a:ln w="0" cap="flat">
-                          <a:miter lim="127000"/>
-                        </a:ln>
-                      </wps:spPr>
-                      <wps:style>
-                        <a:lnRef idx="0">
-                          <a:srgbClr val="000000">
-                            <a:alpha val="0"/>
-                          </a:srgbClr>
-                        </a:lnRef>
-                        <a:fillRef idx="1">
-                          <a:srgbClr val="000000"/>
-                        </a:fillRef>
-                        <a:effectRef idx="0">
-                          <a:scrgbClr r="0" g="0" b="0"/>
-                        </a:effectRef>
-                        <a:fontRef idx="none"/>
-                      </wps:style>
-                      <wps:bodyPr/>
-                    </wps:wsp>
-                  </a:graphicData>
-                </a:graphic>
-              </wp:anchor>
-            </w:drawing>
-          </mc:Choice>
-          <mc:Fallback>
-            <w:pict>
-              <v:shape w14:anchorId="37AA261B" id="Shape 4132" o:spid="_x0000_s1026" style="position:absolute;margin-left:-.35pt;margin-top:16.1pt;width:471pt;height:.75pt;z-index:-251643904;visibility:visible;mso-wrap-style:square;mso-wrap-distance-left:9pt;mso-wrap-distance-top:0;mso-wrap-distance-right:9pt;mso-wrap-distance-bottom:0;mso-position-horizontal:absolute;mso-position-horizontal-relative:text;mso-position-vertical:absolute;mso-position-vertical-relative:text;v-text-anchor:top" coordsize="5981699,9525" o:gfxdata="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" path="m,l5981699,r,9525l,9525,,e" fillcolor="black" stroked="f" strokeweight="0">
-                <v:stroke miterlimit="83231f" joinstyle="miter"/>
-                <v:path arrowok="t" textboxrect="0,0,5981699,9525"/>
-              </v:shape>
-            </w:pict>
-          </mc:Fallback>
-        </mc:AlternateContent>
-      </w:r>
-      <w:r>
-        <w:rPr>
-          <w:lang w:val="en-US"/>
-        </w:rPr>
-        <w:t>Certificates</w:t>
-      </w:r>
-    </w:p>
-    <w:p>
-      <w:pPr>
-        <w:pStyle w:val="a6"/>
-        <w:numPr>
-          <w:ilvl w:val="0"/>
-          <w:numId w:val="12"/>
-        </w:numPr>
-        <w:spacing w:after="0" w:line="240" w:lineRule="auto"/>
-        <w:ind w:left="284" w:right="0" w:hanging="284"/>
-      </w:pPr>
-      <w:r>
-        <w:t>Performance Review Specialist | Jan 29, 2025 | Aston</w:t>
-      </w:r>
-    </w:p>
-    <w:p>
-      <w:pPr>
-        <w:pStyle w:val="a6"/>
-        <w:numPr>
-          <w:ilvl w:val="0"/>
-          <w:numId w:val="12"/>
-        </w:numPr>
-        <w:spacing w:after="0" w:line="240" w:lineRule="auto"/>
-        <w:ind w:left="284" w:right="0" w:hanging="284"/>
-      </w:pPr>
-      <w:r>
-        <w:t xml:space="preserve">IT </w:t>
-      </w:r>
-      <w:proofErr w:type="spellStart"/>
-      <w:r>
-        <w:t>Sourcer</w:t>
-      </w:r>
-      <w:proofErr w:type="spellEnd"/>
-      <w:r>
-        <w:t xml:space="preserve"> | Dec 1, 2023 | Aston</w:t>
-      </w:r>
-    </w:p>
-    <w:p>
-      <w:pPr>
-        <w:pStyle w:val="a6"/>
-        <w:numPr>
-          <w:ilvl w:val="0"/>
-          <w:numId w:val="12"/>
-        </w:numPr>
-        <w:spacing w:after="270" w:line="240" w:lineRule="auto"/>
-        <w:ind w:left="284" w:right="0" w:hanging="284"/>
-      </w:pPr>
-      <w:bookmarkStart w:id="1" w:name="OLE_LINK1"/>
-      <w:bookmarkStart w:id="2" w:name="_Hlk230510470"/>
-      <w:r>
-        <w:t>IT-RECRUITMENT CERTIFICATION COURSE | Sep 5, 2023 | HRPR</w:t>
-      </w:r>
-      <w:bookmarkEnd w:id="1"/>
-      <w:bookmarkEnd w:id="2"/>
     </w:p>
     <w:p>
       <w:pPr>
@@ -1764,6 +1600,59 @@
     </w:p>
     <w:p>
       <w:pPr>
+        <w:pStyle w:val="1"/>
+        <w:spacing w:after="64" w:line="240" w:lineRule="auto"/>
+        <w:ind w:left="11" w:hanging="11"/>
+        <w:jc w:val="both"/>
+      </w:pPr>
+      <w:r>
+        <w:t>Certificates</w:t>
+      </w:r>
+    </w:p>
+    <w:p w14:paraId="cert1" w14:textId="cert1t">
+      <w:pPr>
+        <w:pStyle w:val="a6"/>
+        <w:numPr>
+          <w:ilvl w:val="0"/>
+          <w:numId w:val="12"/>
+        </w:numPr>
+        <w:spacing w:after="0" w:line="240" w:lineRule="auto"/>
+        <w:ind w:left="284" w:right="0" w:hanging="284"/>
+      </w:pPr>
+      <w:r>
+        <w:t>IT-RECRUITMENT CERTIFICATION COURSE | Sep 5, 2023 | HRPR</w:t>
+      </w:r>
+    </w:p>
+    <w:p w14:paraId="cert2" w14:textId="cert2t">
+      <w:pPr>
+        <w:pStyle w:val="a6"/>
+        <w:numPr>
+          <w:ilvl w:val="0"/>
+          <w:numId w:val="12"/>
+        </w:numPr>
+        <w:spacing w:after="0" w:line="240" w:lineRule="auto"/>
+        <w:ind w:left="284" w:right="0" w:hanging="284"/>
+      </w:pPr>
+      <w:r>
+        <w:t>IT Sourcer | Dec 1, 2023 | Aston</w:t>
+      </w:r>
+    </w:p>
+    <w:p w14:paraId="cert3" w14:textId="cert3t">
+      <w:pPr>
+        <w:pStyle w:val="a6"/>
+        <w:numPr>
+          <w:ilvl w:val="0"/>
+          <w:numId w:val="12"/>
+        </w:numPr>
+        <w:spacing w:after="270" w:line="240" w:lineRule="auto"/>
+        <w:ind w:left="284" w:right="0" w:hanging="284"/>
+      </w:pPr>
+      <w:r>
+        <w:t>Performance Review Specialist | Jan 29, 2025 | Aston</w:t>
+      </w:r>
+    </w:p>
+    <w:p>
+      <w:pPr>
         <w:spacing w:after="0" w:line="240" w:lineRule="auto"/>
         <w:ind w:left="0" w:right="55" w:firstLine="0"/>
         <w:jc w:val="both"/>
@@ -1794,7 +1683,7 @@
         <w:t xml:space="preserve"> </w:t>
       </w:r>
       <w:r>
-        <w:t>Native</w:t>
+        <w:t>Native speaker</w:t>
       </w:r>
     </w:p>
     <w:p>
@@ -1829,7 +1718,7 @@
         <w:t xml:space="preserve"> </w:t>
       </w:r>
       <w:r>
-        <w:t>Proficient</w:t>
+        <w:t>Intermediate (B1)</w:t>
       </w:r>
     </w:p>
     <w:sectPr>
@@ -4163,7 +4052,6 @@
   <w:style w:type="character" w:customStyle="1" w:styleId="10">
     <w:name w:val="Заголовок 1 Знак"/>
     <w:link w:val="1"/>
-    <w:uiPriority w:val="9"/>
     <w:rPr>
       <w:rFonts w:ascii="Calibri" w:eastAsia="Calibri" w:hAnsi="Calibri" w:cs="Calibri"/>
       <w:b/>

</xml_diff>

<commit_message>
Update language levels in CV document
</commit_message>
<xml_diff>
--- a/Alesia_Zayats_CV.docx
+++ b/Alesia_Zayats_CV.docx
@@ -43,22 +43,18 @@
         <w:ind w:left="0" w:right="0" w:firstLine="0"/>
         <w:jc w:val="center"/>
       </w:pPr>
-      <w:r>
-        <w:fldChar w:fldCharType="begin"/>
-        <w:instrText>HYPERLINK "mailto:alesiaromasko19@gmail.com"</w:instrText>
-        <w:fldChar w:fldCharType="separate"/>
-      </w:r>
-      <w:r>
-        <w:rPr>
-          <w:rStyle w:val="a3"/>
-        </w:rPr>
-        <w:t>alesiaromasko19@gmail.com</w:t>
-      </w:r>
-      <w:r>
-        <w:fldChar w:fldCharType="end"/>
+      <w:hyperlink r:id="rId5" w:history="1">
+        <w:r>
+          <w:rPr>
+            <w:rStyle w:val="a3"/>
+          </w:rPr>
+          <w:t>alesiaromasko19@gmail.com</w:t>
+        </w:r>
+      </w:hyperlink>
+      <w:r>
         <w:t xml:space="preserve"> | +375298508516 | Belarus, Minsk | linkedin: </w:t>
       </w:r>
-      <w:hyperlink r:id="rId5" w:history="1">
+      <w:hyperlink r:id="rId6" w:history="1">
         <w:r>
           <w:rPr>
             <w:rStyle w:val="a3"/>
@@ -591,7 +587,7 @@
         <w:ind w:left="-5" w:right="0"/>
         <w:jc w:val="both"/>
       </w:pPr>
-      <w:hyperlink r:id="rId6" w:history="1">
+      <w:hyperlink r:id="rId7" w:history="1">
         <w:r>
           <w:rPr>
             <w:rStyle w:val="a3"/>
@@ -935,19 +931,15 @@
         <w:ind w:left="-5" w:right="0"/>
         <w:jc w:val="both"/>
       </w:pPr>
-      <w:r>
-        <w:fldChar w:fldCharType="begin"/>
-        <w:instrText>HYPERLINK "https://astondevs.ru/" \h</w:instrText>
-        <w:fldChar w:fldCharType="separate"/>
-      </w:r>
-      <w:r>
-        <w:rPr>
-          <w:i/>
-        </w:rPr>
-        <w:t>Aston</w:t>
-      </w:r>
-      <w:r>
-        <w:fldChar w:fldCharType="end"/>
+      <w:hyperlink r:id="rId8">
+        <w:r>
+          <w:rPr>
+            <w:i/>
+          </w:rPr>
+          <w:t>Aston</w:t>
+        </w:r>
+      </w:hyperlink>
+      <w:r>
         <w:t xml:space="preserve"> | </w:t>
       </w:r>
       <w:r>
@@ -961,7 +953,6 @@
         <w:rPr>
           <w:i/>
           <w:iCs/>
-          <w:lang w:val="ru-RU"/>
         </w:rPr>
         <w:t>-</w:t>
       </w:r>
@@ -1215,7 +1206,6 @@
       <w:r>
         <w:rPr>
           <w:i/>
-          <w:lang w:val="ru-RU"/>
         </w:rPr>
         <w:t>-</w:t>
       </w:r>
@@ -1327,6 +1317,7 @@
         <w:t>Maintained 90%+ probation success rate across placements</w:t>
       </w:r>
     </w:p>
+    <w:bookmarkStart w:id="0" w:name="_Hlk230510729"/>
     <w:p>
       <w:pPr>
         <w:pStyle w:val="1"/>
@@ -1429,6 +1420,7 @@
         <w:t>Education</w:t>
       </w:r>
     </w:p>
+    <w:bookmarkEnd w:id="0"/>
     <w:p>
       <w:pPr>
         <w:tabs>
@@ -1438,15 +1430,25 @@
         <w:ind w:left="-15" w:right="0" w:firstLine="0"/>
         <w:jc w:val="both"/>
       </w:pPr>
-      <w:hyperlink r:id="rId7">
-        <w:r>
-          <w:rPr>
-            <w:b/>
-          </w:rPr>
-          <w:t>Moscow</w:t>
-        </w:r>
-      </w:hyperlink>
-      <w:hyperlink r:id="rId8">
+      <w:r>
+        <w:fldChar w:fldCharType="begin"/>
+      </w:r>
+      <w:r>
+        <w:instrText>HYPERLINK "https://mi.university/" \h</w:instrText>
+      </w:r>
+      <w:r>
+        <w:fldChar w:fldCharType="separate"/>
+      </w:r>
+      <w:r>
+        <w:rPr>
+          <w:b/>
+        </w:rPr>
+        <w:t>Moscow</w:t>
+      </w:r>
+      <w:r>
+        <w:fldChar w:fldCharType="end"/>
+      </w:r>
+      <w:hyperlink r:id="rId9">
         <w:r>
           <w:rPr>
             <w:b/>
@@ -1454,7 +1456,7 @@
           <w:t xml:space="preserve"> International</w:t>
         </w:r>
       </w:hyperlink>
-      <w:hyperlink r:id="rId9">
+      <w:hyperlink r:id="rId10">
         <w:r>
           <w:rPr>
             <w:b/>
@@ -1468,7 +1470,7 @@
         <w:tabs>
           <w:tab w:val="center" w:pos="6477"/>
         </w:tabs>
-        <w:spacing w:after="30" w:line="240" w:lineRule="auto"/>
+        <w:spacing w:after="270" w:line="240" w:lineRule="auto"/>
         <w:ind w:left="0" w:right="0" w:firstLine="0"/>
         <w:jc w:val="both"/>
       </w:pPr>
@@ -1482,6 +1484,176 @@
         <w:spacing w:after="64" w:line="240" w:lineRule="auto"/>
         <w:ind w:left="11" w:hanging="11"/>
         <w:jc w:val="both"/>
+        <w:rPr>
+          <w:lang w:val="en-US"/>
+        </w:rPr>
+      </w:pPr>
+      <w:r>
+        <w:rPr>
+          <w:bCs/>
+          <w:noProof/>
+        </w:rPr>
+        <mc:AlternateContent>
+          <mc:Choice Requires="wps">
+            <w:drawing>
+              <wp:anchor distT="0" distB="0" distL="114300" distR="114300" simplePos="0" relativeHeight="251672576" behindDoc="1" locked="0" layoutInCell="1" allowOverlap="1" wp14:anchorId="7CC7D3B5" wp14:editId="1911C469">
+                <wp:simplePos x="0" y="0"/>
+                <wp:positionH relativeFrom="column">
+                  <wp:posOffset>-4682</wp:posOffset>
+                </wp:positionH>
+                <wp:positionV relativeFrom="paragraph">
+                  <wp:posOffset>204776</wp:posOffset>
+                </wp:positionV>
+                <wp:extent cx="5981699" cy="9525"/>
+                <wp:effectExtent l="0" t="0" r="635" b="3175"/>
+                <wp:wrapNone/>
+                <wp:docPr id="603896841" name="Shape 4132"/>
+                <wp:cNvGraphicFramePr/>
+                <a:graphic xmlns:a="http://schemas.openxmlformats.org/drawingml/2006/main">
+                  <a:graphicData uri="http://schemas.microsoft.com/office/word/2010/wordprocessingShape">
+                    <wps:wsp>
+                      <wps:cNvSpPr/>
+                      <wps:spPr>
+                        <a:xfrm>
+                          <a:off x="0" y="0"/>
+                          <a:ext cx="5981699" cy="9525"/>
+                        </a:xfrm>
+                        <a:custGeom>
+                          <a:avLst/>
+                          <a:gdLst/>
+                          <a:ahLst/>
+                          <a:cxnLst/>
+                          <a:rect l="0" t="0" r="0" b="0"/>
+                          <a:pathLst>
+                            <a:path w="5981699" h="9525">
+                              <a:moveTo>
+                                <a:pt x="0" y="0"/>
+                              </a:moveTo>
+                              <a:lnTo>
+                                <a:pt x="5981699" y="0"/>
+                              </a:lnTo>
+                              <a:lnTo>
+                                <a:pt x="5981699" y="9525"/>
+                              </a:lnTo>
+                              <a:lnTo>
+                                <a:pt x="0" y="9525"/>
+                              </a:lnTo>
+                              <a:lnTo>
+                                <a:pt x="0" y="0"/>
+                              </a:lnTo>
+                            </a:path>
+                          </a:pathLst>
+                        </a:custGeom>
+                        <a:ln w="0" cap="flat">
+                          <a:miter lim="127000"/>
+                        </a:ln>
+                      </wps:spPr>
+                      <wps:style>
+                        <a:lnRef idx="0">
+                          <a:srgbClr val="000000">
+                            <a:alpha val="0"/>
+                          </a:srgbClr>
+                        </a:lnRef>
+                        <a:fillRef idx="1">
+                          <a:srgbClr val="000000"/>
+                        </a:fillRef>
+                        <a:effectRef idx="0">
+                          <a:scrgbClr r="0" g="0" b="0"/>
+                        </a:effectRef>
+                        <a:fontRef idx="none"/>
+                      </wps:style>
+                      <wps:bodyPr/>
+                    </wps:wsp>
+                  </a:graphicData>
+                </a:graphic>
+              </wp:anchor>
+            </w:drawing>
+          </mc:Choice>
+          <mc:Fallback>
+            <w:pict>
+              <v:shape w14:anchorId="37AA261B" id="Shape 4132" o:spid="_x0000_s1026" style="position:absolute;margin-left:-.35pt;margin-top:16.1pt;width:471pt;height:.75pt;z-index:-251643904;visibility:visible;mso-wrap-style:square;mso-wrap-distance-left:9pt;mso-wrap-distance-top:0;mso-wrap-distance-right:9pt;mso-wrap-distance-bottom:0;mso-position-horizontal:absolute;mso-position-horizontal-relative:text;mso-position-vertical:absolute;mso-position-vertical-relative:text;v-text-anchor:top" coordsize="5981699,9525" o:gfxdata="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" path="m,l5981699,r,9525l,9525,,e" fillcolor="black" stroked="f" strokeweight="0">
+                <v:stroke miterlimit="83231f" joinstyle="miter"/>
+                <v:path arrowok="t" textboxrect="0,0,5981699,9525"/>
+              </v:shape>
+            </w:pict>
+          </mc:Fallback>
+        </mc:AlternateContent>
+      </w:r>
+      <w:r>
+        <w:rPr>
+          <w:lang w:val="en-US"/>
+        </w:rPr>
+        <w:t>Certificates</w:t>
+      </w:r>
+    </w:p>
+    <w:p>
+      <w:pPr>
+        <w:pStyle w:val="a6"/>
+        <w:numPr>
+          <w:ilvl w:val="0"/>
+          <w:numId w:val="12"/>
+        </w:numPr>
+        <w:spacing w:after="0" w:line="240" w:lineRule="auto"/>
+        <w:ind w:left="284" w:right="0" w:hanging="284"/>
+      </w:pPr>
+      <w:r>
+        <w:t>Performance Review Specialist | Jan 29, 2025 | Aston</w:t>
+      </w:r>
+    </w:p>
+    <w:p>
+      <w:pPr>
+        <w:pStyle w:val="a6"/>
+        <w:numPr>
+          <w:ilvl w:val="0"/>
+          <w:numId w:val="12"/>
+        </w:numPr>
+        <w:spacing w:after="0" w:line="240" w:lineRule="auto"/>
+        <w:ind w:left="284" w:right="0" w:hanging="284"/>
+      </w:pPr>
+      <w:r>
+        <w:t xml:space="preserve">IT </w:t>
+      </w:r>
+      <w:proofErr w:type="spellStart"/>
+      <w:r>
+        <w:t>Sourcer</w:t>
+      </w:r>
+      <w:proofErr w:type="spellEnd"/>
+      <w:r>
+        <w:t xml:space="preserve"> | Dec 1, 2023 </w:t>
+      </w:r>
+      <w:bookmarkStart w:id="1" w:name="_Hlk230520410"/>
+      <w:r>
+        <w:t>|</w:t>
+      </w:r>
+      <w:bookmarkEnd w:id="1"/>
+      <w:r>
+        <w:t xml:space="preserve"> Aston</w:t>
+      </w:r>
+    </w:p>
+    <w:p>
+      <w:pPr>
+        <w:pStyle w:val="a6"/>
+        <w:numPr>
+          <w:ilvl w:val="0"/>
+          <w:numId w:val="12"/>
+        </w:numPr>
+        <w:spacing w:after="270" w:line="240" w:lineRule="auto"/>
+        <w:ind w:left="284" w:right="0" w:hanging="284"/>
+      </w:pPr>
+      <w:bookmarkStart w:id="2" w:name="OLE_LINK1"/>
+      <w:bookmarkStart w:id="3" w:name="_Hlk230510470"/>
+      <w:r>
+        <w:t>IT-RECRUITMENT CERTIFICATION COURSE | Sep 5, 2023 | HRPR</w:t>
+      </w:r>
+      <w:bookmarkEnd w:id="2"/>
+      <w:bookmarkEnd w:id="3"/>
+    </w:p>
+    <w:p>
+      <w:pPr>
+        <w:pStyle w:val="1"/>
+        <w:spacing w:after="64" w:line="240" w:lineRule="auto"/>
+        <w:ind w:left="11" w:hanging="11"/>
+        <w:jc w:val="both"/>
       </w:pPr>
       <w:r>
         <w:rPr>
@@ -1491,13 +1663,13 @@
         <mc:AlternateContent>
           <mc:Choice Requires="wpg">
             <w:drawing>
-              <wp:anchor distT="0" distB="0" distL="114300" distR="114300" simplePos="0" relativeHeight="251666432" behindDoc="1" locked="0" layoutInCell="1" allowOverlap="1" wp14:anchorId="1CD2B928" wp14:editId="4F904021">
+              <wp:anchor distT="0" distB="0" distL="114300" distR="114300" simplePos="0" relativeHeight="251666432" behindDoc="1" locked="0" layoutInCell="1" allowOverlap="1" wp14:anchorId="1CD2B928" wp14:editId="13E76689">
                 <wp:simplePos x="0" y="0"/>
                 <wp:positionH relativeFrom="column">
                   <wp:posOffset>-4445</wp:posOffset>
                 </wp:positionH>
                 <wp:positionV relativeFrom="paragraph">
-                  <wp:posOffset>213671</wp:posOffset>
+                  <wp:posOffset>199068</wp:posOffset>
                 </wp:positionV>
                 <wp:extent cx="5981065" cy="9525"/>
                 <wp:effectExtent l="0" t="0" r="635" b="3175"/>
@@ -1584,8 +1756,8 @@
           </mc:Choice>
           <mc:Fallback>
             <w:pict>
-              <v:group w14:anchorId="562E90A9" id="Group 3498" o:spid="_x0000_s1026" style="position:absolute;margin-left:-.35pt;margin-top:16.8pt;width:470.95pt;height:.75pt;z-index:-251650048" coordsize="59816,95" o:gfxdata="UEsDBBQABgAIAAAAIQC2gziS/gAAAOEBAAATAAAAW0NvbnRlbnRfVHlwZXNdLnhtbJSRQU7DMBBF 90jcwfIWJU67QAgl6YK0S0CoHGBkTxKLZGx5TGhvj5O2G0SRWNoz/78nu9wcxkFMGNg6quQqL6RA 0s5Y6ir5vt9lD1JwBDIwOMJKHpHlpr69KfdHjyxSmriSfYz+USnWPY7AufNIadK6MEJMx9ApD/oD OlTrorhX2lFEilmcO2RdNtjC5xDF9pCuTyYBB5bi6bQ4syoJ3g9WQ0ymaiLzg5KdCXlKLjvcW893 SUOqXwnz5DrgnHtJTxOsQfEKIT7DmDSUCaxw7Rqn8787ZsmRM9e2VmPeBN4uqYvTtW7jvijg9N/y JsXecLq0q+WD6m8AAAD//wMAUEsDBBQABgAIAAAAIQA4/SH/1gAAAJQBAAALAAAAX3JlbHMvLnJl bHOkkMFqwzAMhu+DvYPRfXGawxijTi+j0GvpHsDYimMaW0Yy2fr2M4PBMnrbUb/Q94l/f/hMi1qR JVI2sOt6UJgd+ZiDgffL8ekFlFSbvV0oo4EbChzGx4f9GRdb25HMsYhqlCwG5lrLq9biZkxWOiqY 22YiTra2kYMu1l1tQD30/bPm3wwYN0x18gb45AdQl1tp5j/sFB2T0FQ7R0nTNEV3j6o9feQzro1i OWA14Fm+Q8a1a8+Bvu/d/dMb2JY5uiPbhG/ktn4cqGU/er3pcvwCAAD//wMAUEsDBBQABgAIAAAA IQAOguH+cAIAAC0GAAAOAAAAZHJzL2Uyb0RvYy54bWykVNuO0zAQfUfiH6y806SFlm3UdB9Y6AuC Fbt8gOvYSSTfZLtN+/eMJ5dmuyyIpQ/pxJ45mXM8Ppvbk5LkyJ1vjC6S+SxLCNfMlI2uiuTn45d3 NwnxgeqSSqN5kZy5T263b99sWpvzhamNLLkjAKJ93toiqUOweZp6VnNF/cxYrmFTGKdogFdXpaWj LaArmS6ybJW2xpXWGca9h9W7bjPZIr4QnIXvQngeiCwS6C3g0+FzH5/pdkPzylFbN6xvg76iC0Ub DR8doe5ooOTgmmdQqmHOeCPCjBmVGiEaxpEDsJlnV2x2zhwscqnytrKjTCDtlU6vhmXfjjtnH+y9 AyVaW4EW+Ba5nIRT8R+6JCeU7DxKxk+BMFhcrm/m2WqZEAZ76+Vi2SnKapD9WRGrP0/KVuv107J0 +GT6pJHWwmj4C3v/f+wfamo5iupzYH/vSFMWyYf5+1VCNFUwo5hBcAVFwbxRIp97UOtf9HmZKM3Z wYcdN6gzPX71oRvIcohoPUTspIfQwVj/caAtDbEuNhlD0nYHhY3U/TnFTWWO/NFgWrg6LTiMy67U 06x45gg1jAPkDhnDv0W8aeYwHC8mw/WczNBf0vDmjjkQRJ7bTR8gd4in6kodZYCPMAo+IyQNeGFV E8CAZKPAvRYfs+wCDGhx9LrTxiicJY9iSf2DCxgbvBRxwbtq/0k6cqTRZvCH4FTamvar8WJAS30q xogT60Uj5Qg5x9LfQXYIfXKs4+hwY2XWVbK+m87mwCyA9GB20MFYhF82Ooz1Giwa25ywjeHelGc0 CBQE7iJKg56EPHr/jKY3fcesi8tvfwEAAP//AwBQSwMEFAAGAAgAAAAhAFeKoynjAAAADAEAAA8A AABkcnMvZG93bnJldi54bWxMT01vwjAMvU/af4g8aTdIQwfbSlOE2McJTRpMmnYLrWkrGqdqQlv+ /cxpu1iy3/P7SFejbUSPna8daVDTCARS7oqaSg1f+7fJEwgfDBWmcYQaLuhhld3epCYp3ECf2O9C KViEfGI0VCG0iZQ+r9AaP3UtEmNH11kTeO1KWXRmYHHbyFkULaQ1NbFDZVrcVJifdmer4X0wwzpW r/32dNxcfvbzj++tQq3v78aXJY/1EkTAMfx9wLUD54eMgx3cmQovGg2TRyZqiOMFCIafH9QMxIEP cwUyS+X/EtkvAAAA//8DAFBLAQItABQABgAIAAAAIQC2gziS/gAAAOEBAAATAAAAAAAAAAAAAAAA AAAAAABbQ29udGVudF9UeXBlc10ueG1sUEsBAi0AFAAGAAgAAAAhADj9If/WAAAAlAEAAAsAAAAA AAAAAAAAAAAALwEAAF9yZWxzLy5yZWxzUEsBAi0AFAAGAAgAAAAhAA6C4f5wAgAALQYAAA4AAAAA AAAAAAAAAAAALgIAAGRycy9lMm9Eb2MueG1sUEsBAi0AFAAGAAgAAAAhAFeKoynjAAAADAEAAA8A AAAAAAAAAAAAAAAAygQAAGRycy9kb3ducmV2LnhtbFBLBQYAAAAABAAEAPMAAADaBQAAAAA= ">
-                <v:shape id="Shape 4136" o:spid="_x0000_s1027" style="position:absolute;width:59816;height:95;visibility:visible;mso-wrap-style:square;v-text-anchor:top" coordsize="5981699,9525" o:gfxdata="UEsDBBQABgAIAAAAIQDb4fbL7gAAAIUBAAATAAAAW0NvbnRlbnRfVHlwZXNdLnhtbHyQz07DMAyH 70i8Q+QralM4IITa7kDhCAiNB7ASt43WOlEcyvb2pNu4IODoPz9/n1xv9vOkForiPDdwXVagiI23 jocG3rdPxR0oScgWJ8/UwIEENu3lRb09BBKV0ywNjCmFe63FjDSjlD4Q50nv44wpl3HQAc0OB9I3 VXWrjedEnIq03oC27qjHjympx31un0wiTQLq4bS4shrAECZnMGVTvbD9QSnOhDInjzsyuiBXWQP0 r4R18jfgnHvJr4nOknrFmJ5xzhraRtHWf3Kkpfz/yGo5S+H73hkquyhdjr3R8m2lj09svwAAAP// AwBQSwMEFAAGAAgAAAAhAFr0LFu/AAAAFQEAAAsAAABfcmVscy8ucmVsc2zPwWrDMAwG4Ptg72B0 X5TuUMaI01uh19I+gLGVxCy2jGSy9e1nemrHjpL4P0nD4SetZiPRyNnCruvBUPYcYp4tXC/Htw8w Wl0ObuVMFm6kcBhfX4Yzra62kC6xqGlKVgtLreUTUf1CyWnHhXKbTCzJ1VbKjMX5LzcTvvf9HuXR gPHJNKdgQU5hB+ZyK23zHztFL6w81c5zQp6m6P9TMfB3PtPWFCczVQtB9N4U2rp2HOA44NMz4y8A AAD//wMAUEsDBBQABgAIAAAAIQAIe3uXygAAAOIAAAAPAAAAZHJzL2Rvd25yZXYueG1sRI/dasJA FITvC77DcoTe1U2sqERXCVolUAr15wEO2WMSzJ4N2dWkPr1bKPRmYBjmG2a57k0t7tS6yrKCeBSB IM6trrhQcD7t3uYgnEfWWFsmBT/kYL0avCwx0bbjA92PvhABwi5BBaX3TSKly0sy6Ea2IQ7ZxbYG fbBtIXWLXYCbWo6jaCoNVhwWSmxoU1J+Pd6Mgn324b6Kma7HabYz3Weczq6Pb6Veh/12ESRdgPDU +//GHyLTCibx+xR+L4U7IFdPAAAA//8DAFBLAQItABQABgAIAAAAIQDb4fbL7gAAAIUBAAATAAAA AAAAAAAAAAAAAAAAAABbQ29udGVudF9UeXBlc10ueG1sUEsBAi0AFAAGAAgAAAAhAFr0LFu/AAAA FQEAAAsAAAAAAAAAAAAAAAAAHwEAAF9yZWxzLy5yZWxzUEsBAi0AFAAGAAgAAAAhAAh7e5fKAAAA 4gAAAA8AAAAAAAAAAAAAAAAABwIAAGRycy9kb3ducmV2LnhtbFBLBQYAAAAAAwADALcAAAD+AgAA AAA= " path="m,l5981699,r,9525l,9525,,e" fillcolor="black" stroked="f" strokeweight="0">
+              <v:group w14:anchorId="74DCDDD3" id="Group 3498" o:spid="_x0000_s1026" style="position:absolute;margin-left:-.35pt;margin-top:15.65pt;width:470.95pt;height:.75pt;z-index:-251650048" coordsize="59816,95" o:gfxdata="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">
+                <v:shape id="Shape 4136" o:spid="_x0000_s1027" style="position:absolute;width:59816;height:95;visibility:visible;mso-wrap-style:square;v-text-anchor:top" coordsize="5981699,9525" o:gfxdata="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" path="m,l5981699,r,9525l,9525,,e" fillcolor="black" stroked="f" strokeweight="0">
                   <v:stroke miterlimit="83231f" joinstyle="miter"/>
                   <v:path arrowok="t" textboxrect="0,0,5981699,9525"/>
                 </v:shape>
@@ -1600,126 +1772,79 @@
     </w:p>
     <w:p>
       <w:pPr>
-        <w:pStyle w:val="1"/>
-        <w:spacing w:after="64" w:line="240" w:lineRule="auto"/>
-        <w:ind w:left="11" w:hanging="11"/>
-        <w:jc w:val="both"/>
-      </w:pPr>
-      <w:r>
-        <w:t>Certificates</w:t>
-      </w:r>
-    </w:p>
-    <w:p w14:paraId="cert1" w14:textId="cert1t">
-      <w:pPr>
-        <w:pStyle w:val="a6"/>
-        <w:numPr>
-          <w:ilvl w:val="0"/>
-          <w:numId w:val="12"/>
-        </w:numPr>
-        <w:spacing w:after="0" w:line="240" w:lineRule="auto"/>
-        <w:ind w:left="284" w:right="0" w:hanging="284"/>
-      </w:pPr>
-      <w:r>
-        <w:t>IT-RECRUITMENT CERTIFICATION COURSE | Sep 5, 2023 | HRPR</w:t>
-      </w:r>
-    </w:p>
-    <w:p w14:paraId="cert2" w14:textId="cert2t">
-      <w:pPr>
-        <w:pStyle w:val="a6"/>
-        <w:numPr>
-          <w:ilvl w:val="0"/>
-          <w:numId w:val="12"/>
-        </w:numPr>
-        <w:spacing w:after="0" w:line="240" w:lineRule="auto"/>
-        <w:ind w:left="284" w:right="0" w:hanging="284"/>
-      </w:pPr>
-      <w:r>
-        <w:t>IT Sourcer | Dec 1, 2023 | Aston</w:t>
-      </w:r>
-    </w:p>
-    <w:p w14:paraId="cert3" w14:textId="cert3t">
-      <w:pPr>
-        <w:pStyle w:val="a6"/>
-        <w:numPr>
-          <w:ilvl w:val="0"/>
-          <w:numId w:val="12"/>
-        </w:numPr>
-        <w:spacing w:after="270" w:line="240" w:lineRule="auto"/>
-        <w:ind w:left="284" w:right="0" w:hanging="284"/>
-      </w:pPr>
-      <w:r>
-        <w:t>Performance Review Specialist | Jan 29, 2025 | Aston</w:t>
-      </w:r>
-    </w:p>
-    <w:p>
-      <w:pPr>
         <w:spacing w:after="0" w:line="240" w:lineRule="auto"/>
         <w:ind w:left="0" w:right="55" w:firstLine="0"/>
         <w:jc w:val="both"/>
       </w:pPr>
+      <w:bookmarkStart w:id="4" w:name="OLE_LINK3"/>
+      <w:r>
+        <w:rPr>
+          <w:bCs/>
+        </w:rPr>
+        <w:t>E</w:t>
+      </w:r>
+      <w:r>
+        <w:rPr>
+          <w:bCs/>
+        </w:rPr>
+        <w:t>nglish</w:t>
+      </w:r>
+      <w:r>
+        <w:rPr>
+          <w:bCs/>
+        </w:rPr>
+        <w:t>:</w:t>
+      </w:r>
+      <w:r>
+        <w:rPr>
+          <w:bCs/>
+        </w:rPr>
+        <w:t xml:space="preserve"> </w:t>
+      </w:r>
+      <w:r>
+        <w:t>Intermediate</w:t>
+      </w:r>
+      <w:r>
+        <w:t xml:space="preserve"> </w:t>
+      </w:r>
+      <w:r>
+        <w:t>(</w:t>
+      </w:r>
+      <w:r>
+        <w:t>B1</w:t>
+      </w:r>
+      <w:r>
+        <w:t>)</w:t>
+      </w:r>
+    </w:p>
+    <w:p>
+      <w:pPr>
+        <w:spacing w:after="0" w:line="240" w:lineRule="auto"/>
+        <w:ind w:left="0" w:right="55" w:firstLine="0"/>
+        <w:jc w:val="both"/>
+      </w:pPr>
+      <w:r>
+        <w:rPr>
+          <w:bCs/>
+        </w:rPr>
+        <w:t>Russian</w:t>
+      </w:r>
+      <w:r>
+        <w:rPr>
+          <w:bCs/>
+        </w:rPr>
+        <w:t>:</w:t>
+      </w:r>
       <w:r>
         <w:rPr>
           <w:b/>
         </w:rPr>
-        <w:t>Russian</w:t>
-      </w:r>
-      <w:r>
-        <w:rPr>
-          <w:bCs/>
-        </w:rPr>
         <w:t xml:space="preserve"> </w:t>
       </w:r>
       <w:r>
-        <w:rPr>
-          <w:bCs/>
-          <w:lang w:val="ru-RU"/>
-        </w:rPr>
-        <w:t>-</w:t>
-      </w:r>
-      <w:r>
-        <w:rPr>
-          <w:b/>
-        </w:rPr>
-        <w:t xml:space="preserve"> </w:t>
-      </w:r>
-      <w:r>
         <w:t>Native speaker</w:t>
       </w:r>
-    </w:p>
-    <w:p>
-      <w:pPr>
-        <w:spacing w:after="0" w:line="240" w:lineRule="auto"/>
-        <w:ind w:left="0" w:right="55"/>
-        <w:jc w:val="both"/>
-      </w:pPr>
-      <w:r>
-        <w:rPr>
-          <w:b/>
-        </w:rPr>
-        <w:t>English</w:t>
-      </w:r>
-      <w:r>
-        <w:rPr>
-          <w:bCs/>
-        </w:rPr>
-        <w:t xml:space="preserve"> </w:t>
-      </w:r>
-      <w:r>
-        <w:rPr>
-          <w:bCs/>
-          <w:lang w:val="ru-RU"/>
-        </w:rPr>
-        <w:t>-</w:t>
-      </w:r>
-      <w:r>
-        <w:rPr>
-          <w:bCs/>
-        </w:rPr>
-        <w:t xml:space="preserve"> </w:t>
-      </w:r>
-      <w:r>
-        <w:t>Intermediate (B1)</w:t>
-      </w:r>
+      <w:bookmarkEnd w:id="4"/>
     </w:p>
     <w:sectPr>
       <w:pgSz w:w="11899" w:h="16838"/>
@@ -3991,6 +4116,7 @@
   <w:style w:type="paragraph" w:default="1" w:styleId="a">
     <w:name w:val="Normal"/>
     <w:qFormat/>
+    <w:rsid w:val="004A1178"/>
     <w:pPr>
       <w:spacing w:after="3" w:line="225" w:lineRule="auto"/>
       <w:ind w:left="10" w:right="3" w:hanging="10"/>
@@ -4052,6 +4178,7 @@
   <w:style w:type="character" w:customStyle="1" w:styleId="10">
     <w:name w:val="Заголовок 1 Знак"/>
     <w:link w:val="1"/>
+    <w:uiPriority w:val="9"/>
     <w:rPr>
       <w:rFonts w:ascii="Calibri" w:eastAsia="Calibri" w:hAnsi="Calibri" w:cs="Calibri"/>
       <w:b/>

</xml_diff>